<commit_message>
Hoàn thiện NLS mã chuẩn CB cho 318 KHBD Tin học, copy 958 ảnh + NLS cho 148 KHBD Robotics, và tạo skill nang-luc-so
</commit_message>
<xml_diff>
--- a/Hệ thống mẫu văn bản/Nguyên đã làm/Lịch báo giảng/Lịch báo giảng - Tuần 08 (THCS).docx
+++ b/Hệ thống mẫu văn bản/Nguyên đã làm/Lịch báo giảng/Lịch báo giảng - Tuần 08 (THCS).docx
@@ -1,6 +1,6 @@
 
 <file path=word/document.xml><?xml version="1.0" encoding="utf-8"?>
-<w:document xmlns:wpc="http://schemas.microsoft.com/office/word/2010/wordprocessingCanvas" xmlns:cx="http://schemas.microsoft.com/office/drawing/2014/chartex" xmlns:cx1="http://schemas.microsoft.com/office/drawing/2015/9/8/chartex" xmlns:cx2="http://schemas.microsoft.com/office/drawing/2015/10/21/chartex" xmlns:cx3="http://schemas.microsoft.com/office/drawing/2016/5/9/chartex" xmlns:cx4="http://schemas.microsoft.com/office/drawing/2016/5/10/chartex" xmlns:cx5="http://schemas.microsoft.com/office/drawing/2016/5/11/chartex" xmlns:cx6="http://schemas.microsoft.com/office/drawing/2016/5/12/chartex" xmlns:cx7="http://schemas.microsoft.com/office/drawing/2016/5/13/chartex" xmlns:cx8="http://schemas.microsoft.com/office/drawing/2016/5/14/chartex" xmlns:mc="http://schemas.openxmlformats.org/markup-compatibility/2006" xmlns:aink="http://schemas.microsoft.com/office/drawing/2016/ink" xmlns:am3d="http://schemas.microsoft.com/office/drawing/2017/model3d" xmlns:o="urn:schemas-microsoft-com:office:office" xmlns:oel="http://schemas.microsoft.com/office/2019/extlst" xmlns:r="http://schemas.openxmlformats.org/officeDocument/2006/relationships" xmlns:m="http://schemas.openxmlformats.org/officeDocument/2006/math" xmlns:v="urn:schemas-microsoft-com:vml" xmlns:wp14="http://schemas.microsoft.com/office/word/2010/wordprocessingDrawing" xmlns:wp="http://schemas.openxmlformats.org/drawingml/2006/wordprocessingDrawing" xmlns:w10="urn:schemas-microsoft-com:office:word" xmlns:w="http://schemas.openxmlformats.org/wordprocessingml/2006/main" xmlns:w14="http://schemas.microsoft.com/office/word/2010/wordml" xmlns:w15="http://schemas.microsoft.com/office/word/2012/wordml" xmlns:w16cei="http://schemas.microsoft.com/office/word/2026/wordml/cei" xmlns:w16cex="http://schemas.microsoft.com/office/word/2018/wordml/cex" xmlns:w16cid="http://schemas.microsoft.com/office/word/2016/wordml/cid" xmlns:w16="http://schemas.microsoft.com/office/word/2018/wordml" xmlns:w16du="http://schemas.microsoft.com/office/word/2023/wordml/word16du" xmlns:w16sdtdh="http://schemas.microsoft.com/office/word/2020/wordml/sdtdatahash" xmlns:w16sdtfl="http://schemas.microsoft.com/office/word/2024/wordml/sdtformatlock" xmlns:w16se="http://schemas.microsoft.com/office/word/2015/wordml/symex" xmlns:wpg="http://schemas.microsoft.com/office/word/2010/wordprocessingGroup" xmlns:wpi="http://schemas.microsoft.com/office/word/2010/wordprocessingInk" xmlns:wne="http://schemas.microsoft.com/office/word/2006/wordml" xmlns:wps="http://schemas.microsoft.com/office/word/2010/wordprocessingShape" mc:Ignorable="w14 w15 w16se w16cid w16 w16cex w16sdtdh w16sdtfl w16du wp14">
+<w:document xmlns:wpc="http://schemas.microsoft.com/office/word/2010/wordprocessingCanvas" xmlns:cx="http://schemas.microsoft.com/office/drawing/2014/chartex" xmlns:cx1="http://schemas.microsoft.com/office/drawing/2015/9/8/chartex" xmlns:cx2="http://schemas.microsoft.com/office/drawing/2015/10/21/chartex" xmlns:cx3="http://schemas.microsoft.com/office/drawing/2016/5/9/chartex" xmlns:cx4="http://schemas.microsoft.com/office/drawing/2016/5/10/chartex" xmlns:cx5="http://schemas.microsoft.com/office/drawing/2016/5/11/chartex" xmlns:cx6="http://schemas.microsoft.com/office/drawing/2016/5/12/chartex" xmlns:cx7="http://schemas.microsoft.com/office/drawing/2016/5/13/chartex" xmlns:cx8="http://schemas.microsoft.com/office/drawing/2016/5/14/chartex" xmlns:mc="http://schemas.openxmlformats.org/markup-compatibility/2006" xmlns:aink="http://schemas.microsoft.com/office/drawing/2016/ink" xmlns:am3d="http://schemas.microsoft.com/office/drawing/2017/model3d" xmlns:o="urn:schemas-microsoft-com:office:office" xmlns:oel="http://schemas.microsoft.com/office/2019/extlst" xmlns:r="http://schemas.openxmlformats.org/officeDocument/2006/relationships" xmlns:m="http://schemas.openxmlformats.org/officeDocument/2006/math" xmlns:v="urn:schemas-microsoft-com:vml" xmlns:wp14="http://schemas.microsoft.com/office/word/2010/wordprocessingDrawing" xmlns:wp="http://schemas.openxmlformats.org/drawingml/2006/wordprocessingDrawing" xmlns:w10="urn:schemas-microsoft-com:office:word" xmlns:w="http://schemas.openxmlformats.org/wordprocessingml/2006/main" xmlns:w14="http://schemas.microsoft.com/office/word/2010/wordml" xmlns:w15="http://schemas.microsoft.com/office/word/2012/wordml" xmlns:w16cex="http://schemas.microsoft.com/office/word/2018/wordml/cex" xmlns:w16cid="http://schemas.microsoft.com/office/word/2016/wordml/cid" xmlns:w16="http://schemas.microsoft.com/office/word/2018/wordml" xmlns:w16du="http://schemas.microsoft.com/office/word/2023/wordml/word16du" xmlns:w16sdtdh="http://schemas.microsoft.com/office/word/2020/wordml/sdtdatahash" xmlns:w16sdtfl="http://schemas.microsoft.com/office/word/2024/wordml/sdtformatlock" xmlns:w16se="http://schemas.microsoft.com/office/word/2015/wordml/symex" xmlns:wpg="http://schemas.microsoft.com/office/word/2010/wordprocessingGroup" xmlns:wpi="http://schemas.microsoft.com/office/word/2010/wordprocessingInk" xmlns:wne="http://schemas.microsoft.com/office/word/2006/wordml" xmlns:wps="http://schemas.microsoft.com/office/word/2010/wordprocessingShape" mc:Ignorable="w14 w15 w16se w16cid w16 w16cex w16sdtdh w16sdtfl w16du wp14">
   <w:body>
     <w:p>
       <w:pPr>
@@ -394,12 +394,6 @@
                 <w:szCs w:val="26"/>
               </w:rPr>
             </w:pPr>
-            <w:r>
-              <w:rPr>
-                <w:rFonts w:ascii="Times New Roman" w:hAnsi="Times New Roman"/>
-                <w:sz w:val="26"/>
-              </w:rPr>
-            </w:r>
           </w:p>
         </w:tc>
         <w:tc>
@@ -421,12 +415,6 @@
                 <w:szCs w:val="26"/>
               </w:rPr>
             </w:pPr>
-            <w:r>
-              <w:rPr>
-                <w:rFonts w:ascii="Times New Roman" w:hAnsi="Times New Roman"/>
-                <w:sz w:val="26"/>
-              </w:rPr>
-            </w:r>
           </w:p>
         </w:tc>
         <w:tc>
@@ -448,12 +436,6 @@
                 <w:szCs w:val="26"/>
               </w:rPr>
             </w:pPr>
-            <w:r>
-              <w:rPr>
-                <w:rFonts w:ascii="Times New Roman" w:hAnsi="Times New Roman"/>
-                <w:sz w:val="26"/>
-              </w:rPr>
-            </w:r>
           </w:p>
         </w:tc>
         <w:tc>
@@ -475,12 +457,6 @@
                 <w:szCs w:val="26"/>
               </w:rPr>
             </w:pPr>
-            <w:r>
-              <w:rPr>
-                <w:rFonts w:ascii="Times New Roman" w:hAnsi="Times New Roman"/>
-                <w:sz w:val="26"/>
-              </w:rPr>
-            </w:r>
           </w:p>
         </w:tc>
         <w:tc>
@@ -502,12 +478,6 @@
                 <w:szCs w:val="26"/>
               </w:rPr>
             </w:pPr>
-            <w:r>
-              <w:rPr>
-                <w:rFonts w:ascii="Times New Roman" w:hAnsi="Times New Roman"/>
-                <w:sz w:val="26"/>
-              </w:rPr>
-            </w:r>
           </w:p>
         </w:tc>
       </w:tr>
@@ -585,12 +555,6 @@
                 <w:szCs w:val="26"/>
               </w:rPr>
             </w:pPr>
-            <w:r>
-              <w:rPr>
-                <w:rFonts w:ascii="Times New Roman" w:hAnsi="Times New Roman"/>
-                <w:sz w:val="26"/>
-              </w:rPr>
-            </w:r>
           </w:p>
         </w:tc>
         <w:tc>
@@ -612,12 +576,6 @@
                 <w:szCs w:val="26"/>
               </w:rPr>
             </w:pPr>
-            <w:r>
-              <w:rPr>
-                <w:rFonts w:ascii="Times New Roman" w:hAnsi="Times New Roman"/>
-                <w:sz w:val="26"/>
-              </w:rPr>
-            </w:r>
           </w:p>
         </w:tc>
         <w:tc>
@@ -639,12 +597,6 @@
                 <w:szCs w:val="26"/>
               </w:rPr>
             </w:pPr>
-            <w:r>
-              <w:rPr>
-                <w:rFonts w:ascii="Times New Roman" w:hAnsi="Times New Roman"/>
-                <w:sz w:val="26"/>
-              </w:rPr>
-            </w:r>
           </w:p>
         </w:tc>
         <w:tc>
@@ -666,12 +618,6 @@
                 <w:szCs w:val="26"/>
               </w:rPr>
             </w:pPr>
-            <w:r>
-              <w:rPr>
-                <w:rFonts w:ascii="Times New Roman" w:hAnsi="Times New Roman"/>
-                <w:sz w:val="26"/>
-              </w:rPr>
-            </w:r>
           </w:p>
         </w:tc>
         <w:tc>
@@ -693,12 +639,6 @@
                 <w:szCs w:val="26"/>
               </w:rPr>
             </w:pPr>
-            <w:r>
-              <w:rPr>
-                <w:rFonts w:ascii="Times New Roman" w:hAnsi="Times New Roman"/>
-                <w:sz w:val="26"/>
-              </w:rPr>
-            </w:r>
           </w:p>
         </w:tc>
       </w:tr>
@@ -776,12 +716,6 @@
                 <w:szCs w:val="26"/>
               </w:rPr>
             </w:pPr>
-            <w:r>
-              <w:rPr>
-                <w:rFonts w:ascii="Times New Roman" w:hAnsi="Times New Roman"/>
-                <w:sz w:val="26"/>
-              </w:rPr>
-            </w:r>
           </w:p>
         </w:tc>
         <w:tc>
@@ -803,12 +737,6 @@
                 <w:szCs w:val="26"/>
               </w:rPr>
             </w:pPr>
-            <w:r>
-              <w:rPr>
-                <w:rFonts w:ascii="Times New Roman" w:hAnsi="Times New Roman"/>
-                <w:sz w:val="26"/>
-              </w:rPr>
-            </w:r>
           </w:p>
         </w:tc>
         <w:tc>
@@ -830,12 +758,6 @@
                 <w:szCs w:val="26"/>
               </w:rPr>
             </w:pPr>
-            <w:r>
-              <w:rPr>
-                <w:rFonts w:ascii="Times New Roman" w:hAnsi="Times New Roman"/>
-                <w:sz w:val="26"/>
-              </w:rPr>
-            </w:r>
           </w:p>
         </w:tc>
         <w:tc>
@@ -857,12 +779,6 @@
                 <w:szCs w:val="26"/>
               </w:rPr>
             </w:pPr>
-            <w:r>
-              <w:rPr>
-                <w:rFonts w:ascii="Times New Roman" w:hAnsi="Times New Roman"/>
-                <w:sz w:val="26"/>
-              </w:rPr>
-            </w:r>
           </w:p>
         </w:tc>
         <w:tc>
@@ -884,12 +800,6 @@
                 <w:szCs w:val="26"/>
               </w:rPr>
             </w:pPr>
-            <w:r>
-              <w:rPr>
-                <w:rFonts w:ascii="Times New Roman" w:hAnsi="Times New Roman"/>
-                <w:sz w:val="26"/>
-              </w:rPr>
-            </w:r>
           </w:p>
         </w:tc>
       </w:tr>
@@ -967,13 +877,6 @@
                 <w:szCs w:val="26"/>
               </w:rPr>
             </w:pPr>
-            <w:r>
-              <w:rPr>
-                <w:rFonts w:ascii="Times New Roman" w:hAnsi="Times New Roman" w:cs="Times New Roman"/>
-                <w:sz w:val="26"/>
-                <w:szCs w:val="26"/>
-              </w:rPr>
-            </w:r>
           </w:p>
         </w:tc>
         <w:tc>
@@ -995,13 +898,6 @@
                 <w:szCs w:val="26"/>
               </w:rPr>
             </w:pPr>
-            <w:r>
-              <w:rPr>
-                <w:rFonts w:ascii="Times New Roman" w:hAnsi="Times New Roman" w:cs="Times New Roman"/>
-                <w:sz w:val="26"/>
-                <w:szCs w:val="26"/>
-              </w:rPr>
-            </w:r>
           </w:p>
         </w:tc>
         <w:tc>
@@ -1023,13 +919,6 @@
                 <w:szCs w:val="26"/>
               </w:rPr>
             </w:pPr>
-            <w:r>
-              <w:rPr>
-                <w:rFonts w:ascii="Times New Roman" w:hAnsi="Times New Roman" w:cs="Times New Roman"/>
-                <w:sz w:val="26"/>
-                <w:szCs w:val="26"/>
-              </w:rPr>
-            </w:r>
           </w:p>
         </w:tc>
         <w:tc>
@@ -1051,13 +940,6 @@
                 <w:szCs w:val="26"/>
               </w:rPr>
             </w:pPr>
-            <w:r>
-              <w:rPr>
-                <w:rFonts w:ascii="Times New Roman" w:hAnsi="Times New Roman" w:cs="Times New Roman"/>
-                <w:sz w:val="26"/>
-                <w:szCs w:val="26"/>
-              </w:rPr>
-            </w:r>
           </w:p>
         </w:tc>
         <w:tc>
@@ -1079,13 +961,6 @@
                 <w:szCs w:val="26"/>
               </w:rPr>
             </w:pPr>
-            <w:r>
-              <w:rPr>
-                <w:rFonts w:ascii="Times New Roman" w:hAnsi="Times New Roman" w:cs="Times New Roman"/>
-                <w:sz w:val="26"/>
-                <w:szCs w:val="26"/>
-              </w:rPr>
-            </w:r>
           </w:p>
         </w:tc>
       </w:tr>
@@ -1163,12 +1038,6 @@
                 <w:szCs w:val="26"/>
               </w:rPr>
             </w:pPr>
-            <w:r>
-              <w:rPr>
-                <w:rFonts w:ascii="Times New Roman" w:hAnsi="Times New Roman"/>
-                <w:sz w:val="26"/>
-              </w:rPr>
-            </w:r>
           </w:p>
         </w:tc>
         <w:tc>
@@ -1190,12 +1059,6 @@
                 <w:szCs w:val="26"/>
               </w:rPr>
             </w:pPr>
-            <w:r>
-              <w:rPr>
-                <w:rFonts w:ascii="Times New Roman" w:hAnsi="Times New Roman"/>
-                <w:sz w:val="26"/>
-              </w:rPr>
-            </w:r>
           </w:p>
         </w:tc>
         <w:tc>
@@ -1217,12 +1080,6 @@
                 <w:szCs w:val="26"/>
               </w:rPr>
             </w:pPr>
-            <w:r>
-              <w:rPr>
-                <w:rFonts w:ascii="Times New Roman" w:hAnsi="Times New Roman"/>
-                <w:sz w:val="26"/>
-              </w:rPr>
-            </w:r>
           </w:p>
         </w:tc>
         <w:tc>
@@ -1244,12 +1101,6 @@
                 <w:szCs w:val="26"/>
               </w:rPr>
             </w:pPr>
-            <w:r>
-              <w:rPr>
-                <w:rFonts w:ascii="Times New Roman" w:hAnsi="Times New Roman"/>
-                <w:sz w:val="26"/>
-              </w:rPr>
-            </w:r>
           </w:p>
         </w:tc>
         <w:tc>
@@ -1271,12 +1122,6 @@
                 <w:szCs w:val="26"/>
               </w:rPr>
             </w:pPr>
-            <w:r>
-              <w:rPr>
-                <w:rFonts w:ascii="Times New Roman" w:hAnsi="Times New Roman"/>
-                <w:sz w:val="26"/>
-              </w:rPr>
-            </w:r>
           </w:p>
         </w:tc>
       </w:tr>
@@ -1360,12 +1205,6 @@
                 <w:szCs w:val="26"/>
               </w:rPr>
             </w:pPr>
-            <w:r>
-              <w:rPr>
-                <w:rFonts w:ascii="Times New Roman" w:hAnsi="Times New Roman"/>
-                <w:sz w:val="26"/>
-              </w:rPr>
-            </w:r>
           </w:p>
         </w:tc>
         <w:tc>
@@ -1387,12 +1226,6 @@
                 <w:szCs w:val="26"/>
               </w:rPr>
             </w:pPr>
-            <w:r>
-              <w:rPr>
-                <w:rFonts w:ascii="Times New Roman" w:hAnsi="Times New Roman"/>
-                <w:sz w:val="26"/>
-              </w:rPr>
-            </w:r>
           </w:p>
         </w:tc>
         <w:tc>
@@ -1414,12 +1247,6 @@
                 <w:szCs w:val="26"/>
               </w:rPr>
             </w:pPr>
-            <w:r>
-              <w:rPr>
-                <w:rFonts w:ascii="Times New Roman" w:hAnsi="Times New Roman"/>
-                <w:sz w:val="26"/>
-              </w:rPr>
-            </w:r>
           </w:p>
         </w:tc>
         <w:tc>
@@ -1441,12 +1268,6 @@
                 <w:szCs w:val="26"/>
               </w:rPr>
             </w:pPr>
-            <w:r>
-              <w:rPr>
-                <w:rFonts w:ascii="Times New Roman" w:hAnsi="Times New Roman"/>
-                <w:sz w:val="26"/>
-              </w:rPr>
-            </w:r>
           </w:p>
         </w:tc>
         <w:tc>
@@ -1468,12 +1289,6 @@
                 <w:szCs w:val="26"/>
               </w:rPr>
             </w:pPr>
-            <w:r>
-              <w:rPr>
-                <w:rFonts w:ascii="Times New Roman" w:hAnsi="Times New Roman"/>
-                <w:sz w:val="26"/>
-              </w:rPr>
-            </w:r>
           </w:p>
         </w:tc>
       </w:tr>
@@ -1553,12 +1368,6 @@
                 <w:szCs w:val="26"/>
               </w:rPr>
             </w:pPr>
-            <w:r>
-              <w:rPr>
-                <w:rFonts w:ascii="Times New Roman" w:hAnsi="Times New Roman"/>
-                <w:sz w:val="26"/>
-              </w:rPr>
-            </w:r>
           </w:p>
         </w:tc>
         <w:tc>
@@ -1580,12 +1389,6 @@
                 <w:szCs w:val="26"/>
               </w:rPr>
             </w:pPr>
-            <w:r>
-              <w:rPr>
-                <w:rFonts w:ascii="Times New Roman" w:hAnsi="Times New Roman"/>
-                <w:sz w:val="26"/>
-              </w:rPr>
-            </w:r>
           </w:p>
         </w:tc>
         <w:tc>
@@ -1607,12 +1410,6 @@
                 <w:szCs w:val="26"/>
               </w:rPr>
             </w:pPr>
-            <w:r>
-              <w:rPr>
-                <w:rFonts w:ascii="Times New Roman" w:hAnsi="Times New Roman"/>
-                <w:sz w:val="26"/>
-              </w:rPr>
-            </w:r>
           </w:p>
         </w:tc>
         <w:tc>
@@ -1634,12 +1431,6 @@
                 <w:szCs w:val="26"/>
               </w:rPr>
             </w:pPr>
-            <w:r>
-              <w:rPr>
-                <w:rFonts w:ascii="Times New Roman" w:hAnsi="Times New Roman"/>
-                <w:sz w:val="26"/>
-              </w:rPr>
-            </w:r>
           </w:p>
         </w:tc>
         <w:tc>
@@ -1661,12 +1452,6 @@
                 <w:szCs w:val="26"/>
               </w:rPr>
             </w:pPr>
-            <w:r>
-              <w:rPr>
-                <w:rFonts w:ascii="Times New Roman" w:hAnsi="Times New Roman"/>
-                <w:sz w:val="26"/>
-              </w:rPr>
-            </w:r>
           </w:p>
         </w:tc>
       </w:tr>
@@ -1746,13 +1531,6 @@
                 <w:szCs w:val="26"/>
               </w:rPr>
             </w:pPr>
-            <w:r>
-              <w:rPr>
-                <w:rFonts w:ascii="Times New Roman" w:hAnsi="Times New Roman" w:cs="Times New Roman"/>
-                <w:sz w:val="26"/>
-                <w:szCs w:val="26"/>
-              </w:rPr>
-            </w:r>
           </w:p>
         </w:tc>
         <w:tc>
@@ -1774,13 +1552,6 @@
                 <w:szCs w:val="26"/>
               </w:rPr>
             </w:pPr>
-            <w:r>
-              <w:rPr>
-                <w:rFonts w:ascii="Times New Roman" w:hAnsi="Times New Roman" w:cs="Times New Roman"/>
-                <w:sz w:val="26"/>
-                <w:szCs w:val="26"/>
-              </w:rPr>
-            </w:r>
           </w:p>
         </w:tc>
         <w:tc>
@@ -1802,13 +1573,6 @@
                 <w:szCs w:val="26"/>
               </w:rPr>
             </w:pPr>
-            <w:r>
-              <w:rPr>
-                <w:rFonts w:ascii="Times New Roman" w:hAnsi="Times New Roman" w:cs="Times New Roman"/>
-                <w:sz w:val="26"/>
-                <w:szCs w:val="26"/>
-              </w:rPr>
-            </w:r>
           </w:p>
         </w:tc>
         <w:tc>
@@ -1830,13 +1594,6 @@
                 <w:szCs w:val="26"/>
               </w:rPr>
             </w:pPr>
-            <w:r>
-              <w:rPr>
-                <w:rFonts w:ascii="Times New Roman" w:hAnsi="Times New Roman" w:cs="Times New Roman"/>
-                <w:sz w:val="26"/>
-                <w:szCs w:val="26"/>
-              </w:rPr>
-            </w:r>
           </w:p>
         </w:tc>
         <w:tc>
@@ -1858,13 +1615,6 @@
                 <w:szCs w:val="26"/>
               </w:rPr>
             </w:pPr>
-            <w:r>
-              <w:rPr>
-                <w:rFonts w:ascii="Times New Roman" w:hAnsi="Times New Roman" w:cs="Times New Roman"/>
-                <w:sz w:val="26"/>
-                <w:szCs w:val="26"/>
-              </w:rPr>
-            </w:r>
           </w:p>
         </w:tc>
       </w:tr>
@@ -1944,13 +1694,6 @@
                 <w:szCs w:val="26"/>
               </w:rPr>
             </w:pPr>
-            <w:r>
-              <w:rPr>
-                <w:rFonts w:ascii="Times New Roman" w:hAnsi="Times New Roman" w:cs="Times New Roman"/>
-                <w:sz w:val="26"/>
-                <w:szCs w:val="26"/>
-              </w:rPr>
-            </w:r>
           </w:p>
         </w:tc>
         <w:tc>
@@ -1972,13 +1715,6 @@
                 <w:szCs w:val="26"/>
               </w:rPr>
             </w:pPr>
-            <w:r>
-              <w:rPr>
-                <w:rFonts w:ascii="Times New Roman" w:hAnsi="Times New Roman" w:cs="Times New Roman"/>
-                <w:sz w:val="26"/>
-                <w:szCs w:val="26"/>
-              </w:rPr>
-            </w:r>
           </w:p>
         </w:tc>
         <w:tc>
@@ -2000,13 +1736,6 @@
                 <w:szCs w:val="26"/>
               </w:rPr>
             </w:pPr>
-            <w:r>
-              <w:rPr>
-                <w:rFonts w:ascii="Times New Roman" w:hAnsi="Times New Roman" w:cs="Times New Roman"/>
-                <w:sz w:val="26"/>
-                <w:szCs w:val="26"/>
-              </w:rPr>
-            </w:r>
           </w:p>
         </w:tc>
         <w:tc>
@@ -2028,13 +1757,6 @@
                 <w:szCs w:val="26"/>
               </w:rPr>
             </w:pPr>
-            <w:r>
-              <w:rPr>
-                <w:rFonts w:ascii="Times New Roman" w:hAnsi="Times New Roman" w:cs="Times New Roman"/>
-                <w:sz w:val="26"/>
-                <w:szCs w:val="26"/>
-              </w:rPr>
-            </w:r>
           </w:p>
         </w:tc>
         <w:tc>
@@ -2056,13 +1778,6 @@
                 <w:szCs w:val="26"/>
               </w:rPr>
             </w:pPr>
-            <w:r>
-              <w:rPr>
-                <w:rFonts w:ascii="Times New Roman" w:hAnsi="Times New Roman" w:cs="Times New Roman"/>
-                <w:sz w:val="26"/>
-                <w:szCs w:val="26"/>
-              </w:rPr>
-            </w:r>
           </w:p>
         </w:tc>
       </w:tr>
@@ -2142,12 +1857,6 @@
                 <w:szCs w:val="26"/>
               </w:rPr>
             </w:pPr>
-            <w:r>
-              <w:rPr>
-                <w:rFonts w:ascii="Times New Roman" w:hAnsi="Times New Roman"/>
-                <w:sz w:val="26"/>
-              </w:rPr>
-            </w:r>
           </w:p>
         </w:tc>
         <w:tc>
@@ -2169,12 +1878,6 @@
                 <w:szCs w:val="26"/>
               </w:rPr>
             </w:pPr>
-            <w:r>
-              <w:rPr>
-                <w:rFonts w:ascii="Times New Roman" w:hAnsi="Times New Roman"/>
-                <w:sz w:val="26"/>
-              </w:rPr>
-            </w:r>
           </w:p>
         </w:tc>
         <w:tc>
@@ -2196,12 +1899,6 @@
                 <w:szCs w:val="26"/>
               </w:rPr>
             </w:pPr>
-            <w:r>
-              <w:rPr>
-                <w:rFonts w:ascii="Times New Roman" w:hAnsi="Times New Roman"/>
-                <w:sz w:val="26"/>
-              </w:rPr>
-            </w:r>
           </w:p>
         </w:tc>
         <w:tc>
@@ -2223,12 +1920,6 @@
                 <w:szCs w:val="26"/>
               </w:rPr>
             </w:pPr>
-            <w:r>
-              <w:rPr>
-                <w:rFonts w:ascii="Times New Roman" w:hAnsi="Times New Roman"/>
-                <w:sz w:val="26"/>
-              </w:rPr>
-            </w:r>
           </w:p>
         </w:tc>
         <w:tc>
@@ -2250,12 +1941,6 @@
                 <w:szCs w:val="26"/>
               </w:rPr>
             </w:pPr>
-            <w:r>
-              <w:rPr>
-                <w:rFonts w:ascii="Times New Roman" w:hAnsi="Times New Roman"/>
-                <w:sz w:val="26"/>
-              </w:rPr>
-            </w:r>
           </w:p>
         </w:tc>
       </w:tr>
@@ -2339,12 +2024,6 @@
                 <w:szCs w:val="26"/>
               </w:rPr>
             </w:pPr>
-            <w:r>
-              <w:rPr>
-                <w:rFonts w:ascii="Times New Roman" w:hAnsi="Times New Roman"/>
-                <w:sz w:val="26"/>
-              </w:rPr>
-            </w:r>
           </w:p>
         </w:tc>
         <w:tc>
@@ -2366,12 +2045,6 @@
                 <w:szCs w:val="26"/>
               </w:rPr>
             </w:pPr>
-            <w:r>
-              <w:rPr>
-                <w:rFonts w:ascii="Times New Roman" w:hAnsi="Times New Roman"/>
-                <w:sz w:val="26"/>
-              </w:rPr>
-            </w:r>
           </w:p>
         </w:tc>
         <w:tc>
@@ -2393,12 +2066,6 @@
                 <w:szCs w:val="26"/>
               </w:rPr>
             </w:pPr>
-            <w:r>
-              <w:rPr>
-                <w:rFonts w:ascii="Times New Roman" w:hAnsi="Times New Roman"/>
-                <w:sz w:val="26"/>
-              </w:rPr>
-            </w:r>
           </w:p>
         </w:tc>
         <w:tc>
@@ -2420,12 +2087,6 @@
                 <w:szCs w:val="26"/>
               </w:rPr>
             </w:pPr>
-            <w:r>
-              <w:rPr>
-                <w:rFonts w:ascii="Times New Roman" w:hAnsi="Times New Roman"/>
-                <w:sz w:val="26"/>
-              </w:rPr>
-            </w:r>
           </w:p>
         </w:tc>
         <w:tc>
@@ -2447,12 +2108,6 @@
                 <w:szCs w:val="26"/>
               </w:rPr>
             </w:pPr>
-            <w:r>
-              <w:rPr>
-                <w:rFonts w:ascii="Times New Roman" w:hAnsi="Times New Roman"/>
-                <w:sz w:val="26"/>
-              </w:rPr>
-            </w:r>
           </w:p>
         </w:tc>
       </w:tr>
@@ -2532,13 +2187,6 @@
                 <w:szCs w:val="26"/>
               </w:rPr>
             </w:pPr>
-            <w:r>
-              <w:rPr>
-                <w:rFonts w:ascii="Times New Roman" w:hAnsi="Times New Roman" w:cs="Times New Roman"/>
-                <w:sz w:val="26"/>
-                <w:szCs w:val="26"/>
-              </w:rPr>
-            </w:r>
           </w:p>
         </w:tc>
         <w:tc>
@@ -2560,13 +2208,6 @@
                 <w:szCs w:val="26"/>
               </w:rPr>
             </w:pPr>
-            <w:r>
-              <w:rPr>
-                <w:rFonts w:ascii="Times New Roman" w:hAnsi="Times New Roman" w:cs="Times New Roman"/>
-                <w:sz w:val="26"/>
-                <w:szCs w:val="26"/>
-              </w:rPr>
-            </w:r>
           </w:p>
         </w:tc>
         <w:tc>
@@ -2588,13 +2229,6 @@
                 <w:szCs w:val="26"/>
               </w:rPr>
             </w:pPr>
-            <w:r>
-              <w:rPr>
-                <w:rFonts w:ascii="Times New Roman" w:hAnsi="Times New Roman" w:cs="Times New Roman"/>
-                <w:sz w:val="26"/>
-                <w:szCs w:val="26"/>
-              </w:rPr>
-            </w:r>
           </w:p>
         </w:tc>
         <w:tc>
@@ -2616,13 +2250,6 @@
                 <w:szCs w:val="26"/>
               </w:rPr>
             </w:pPr>
-            <w:r>
-              <w:rPr>
-                <w:rFonts w:ascii="Times New Roman" w:hAnsi="Times New Roman" w:cs="Times New Roman"/>
-                <w:sz w:val="26"/>
-                <w:szCs w:val="26"/>
-              </w:rPr>
-            </w:r>
           </w:p>
         </w:tc>
         <w:tc>
@@ -2644,13 +2271,6 @@
                 <w:szCs w:val="26"/>
               </w:rPr>
             </w:pPr>
-            <w:r>
-              <w:rPr>
-                <w:rFonts w:ascii="Times New Roman" w:hAnsi="Times New Roman" w:cs="Times New Roman"/>
-                <w:sz w:val="26"/>
-                <w:szCs w:val="26"/>
-              </w:rPr>
-            </w:r>
           </w:p>
         </w:tc>
       </w:tr>
@@ -2730,12 +2350,6 @@
                 <w:szCs w:val="26"/>
               </w:rPr>
             </w:pPr>
-            <w:r>
-              <w:rPr>
-                <w:rFonts w:ascii="Times New Roman" w:hAnsi="Times New Roman"/>
-                <w:sz w:val="26"/>
-              </w:rPr>
-            </w:r>
           </w:p>
         </w:tc>
         <w:tc>
@@ -2757,12 +2371,6 @@
                 <w:szCs w:val="26"/>
               </w:rPr>
             </w:pPr>
-            <w:r>
-              <w:rPr>
-                <w:rFonts w:ascii="Times New Roman" w:hAnsi="Times New Roman"/>
-                <w:sz w:val="26"/>
-              </w:rPr>
-            </w:r>
           </w:p>
         </w:tc>
         <w:tc>
@@ -2784,12 +2392,6 @@
                 <w:szCs w:val="26"/>
               </w:rPr>
             </w:pPr>
-            <w:r>
-              <w:rPr>
-                <w:rFonts w:ascii="Times New Roman" w:hAnsi="Times New Roman"/>
-                <w:sz w:val="26"/>
-              </w:rPr>
-            </w:r>
           </w:p>
         </w:tc>
         <w:tc>
@@ -2811,12 +2413,6 @@
                 <w:szCs w:val="26"/>
               </w:rPr>
             </w:pPr>
-            <w:r>
-              <w:rPr>
-                <w:rFonts w:ascii="Times New Roman" w:hAnsi="Times New Roman"/>
-                <w:sz w:val="26"/>
-              </w:rPr>
-            </w:r>
           </w:p>
         </w:tc>
         <w:tc>
@@ -2838,12 +2434,6 @@
                 <w:szCs w:val="26"/>
               </w:rPr>
             </w:pPr>
-            <w:r>
-              <w:rPr>
-                <w:rFonts w:ascii="Times New Roman" w:hAnsi="Times New Roman"/>
-                <w:sz w:val="26"/>
-              </w:rPr>
-            </w:r>
           </w:p>
         </w:tc>
       </w:tr>
@@ -2923,13 +2513,6 @@
                 <w:szCs w:val="26"/>
               </w:rPr>
             </w:pPr>
-            <w:r>
-              <w:rPr>
-                <w:rFonts w:ascii="Times New Roman" w:hAnsi="Times New Roman" w:cs="Times New Roman"/>
-                <w:sz w:val="26"/>
-                <w:szCs w:val="26"/>
-              </w:rPr>
-            </w:r>
           </w:p>
         </w:tc>
         <w:tc>
@@ -2951,13 +2534,6 @@
                 <w:szCs w:val="26"/>
               </w:rPr>
             </w:pPr>
-            <w:r>
-              <w:rPr>
-                <w:rFonts w:ascii="Times New Roman" w:hAnsi="Times New Roman" w:cs="Times New Roman"/>
-                <w:sz w:val="26"/>
-                <w:szCs w:val="26"/>
-              </w:rPr>
-            </w:r>
           </w:p>
         </w:tc>
         <w:tc>
@@ -2979,13 +2555,6 @@
                 <w:szCs w:val="26"/>
               </w:rPr>
             </w:pPr>
-            <w:r>
-              <w:rPr>
-                <w:rFonts w:ascii="Times New Roman" w:hAnsi="Times New Roman" w:cs="Times New Roman"/>
-                <w:sz w:val="26"/>
-                <w:szCs w:val="26"/>
-              </w:rPr>
-            </w:r>
           </w:p>
         </w:tc>
         <w:tc>
@@ -3007,13 +2576,6 @@
                 <w:szCs w:val="26"/>
               </w:rPr>
             </w:pPr>
-            <w:r>
-              <w:rPr>
-                <w:rFonts w:ascii="Times New Roman" w:hAnsi="Times New Roman" w:cs="Times New Roman"/>
-                <w:sz w:val="26"/>
-                <w:szCs w:val="26"/>
-              </w:rPr>
-            </w:r>
           </w:p>
         </w:tc>
         <w:tc>
@@ -3035,13 +2597,6 @@
                 <w:szCs w:val="26"/>
               </w:rPr>
             </w:pPr>
-            <w:r>
-              <w:rPr>
-                <w:rFonts w:ascii="Times New Roman" w:hAnsi="Times New Roman" w:cs="Times New Roman"/>
-                <w:sz w:val="26"/>
-                <w:szCs w:val="26"/>
-              </w:rPr>
-            </w:r>
           </w:p>
         </w:tc>
       </w:tr>
@@ -3121,12 +2676,6 @@
                 <w:szCs w:val="26"/>
               </w:rPr>
             </w:pPr>
-            <w:r>
-              <w:rPr>
-                <w:rFonts w:ascii="Times New Roman" w:hAnsi="Times New Roman"/>
-                <w:sz w:val="26"/>
-              </w:rPr>
-            </w:r>
           </w:p>
         </w:tc>
         <w:tc>
@@ -3148,12 +2697,6 @@
                 <w:szCs w:val="26"/>
               </w:rPr>
             </w:pPr>
-            <w:r>
-              <w:rPr>
-                <w:rFonts w:ascii="Times New Roman" w:hAnsi="Times New Roman"/>
-                <w:sz w:val="26"/>
-              </w:rPr>
-            </w:r>
           </w:p>
         </w:tc>
         <w:tc>
@@ -3175,12 +2718,6 @@
                 <w:szCs w:val="26"/>
               </w:rPr>
             </w:pPr>
-            <w:r>
-              <w:rPr>
-                <w:rFonts w:ascii="Times New Roman" w:hAnsi="Times New Roman"/>
-                <w:sz w:val="26"/>
-              </w:rPr>
-            </w:r>
           </w:p>
         </w:tc>
         <w:tc>
@@ -3202,12 +2739,6 @@
                 <w:szCs w:val="26"/>
               </w:rPr>
             </w:pPr>
-            <w:r>
-              <w:rPr>
-                <w:rFonts w:ascii="Times New Roman" w:hAnsi="Times New Roman"/>
-                <w:sz w:val="26"/>
-              </w:rPr>
-            </w:r>
           </w:p>
         </w:tc>
         <w:tc>
@@ -3229,12 +2760,6 @@
                 <w:szCs w:val="26"/>
               </w:rPr>
             </w:pPr>
-            <w:r>
-              <w:rPr>
-                <w:rFonts w:ascii="Times New Roman" w:hAnsi="Times New Roman"/>
-                <w:sz w:val="26"/>
-              </w:rPr>
-            </w:r>
           </w:p>
         </w:tc>
       </w:tr>
@@ -3318,13 +2843,6 @@
                 <w:szCs w:val="26"/>
               </w:rPr>
             </w:pPr>
-            <w:r>
-              <w:rPr>
-                <w:rFonts w:ascii="Times New Roman" w:hAnsi="Times New Roman" w:cs="Times New Roman"/>
-                <w:sz w:val="26"/>
-                <w:szCs w:val="26"/>
-              </w:rPr>
-            </w:r>
           </w:p>
         </w:tc>
         <w:tc>
@@ -3346,13 +2864,6 @@
                 <w:szCs w:val="26"/>
               </w:rPr>
             </w:pPr>
-            <w:r>
-              <w:rPr>
-                <w:rFonts w:ascii="Times New Roman" w:hAnsi="Times New Roman" w:cs="Times New Roman"/>
-                <w:sz w:val="26"/>
-                <w:szCs w:val="26"/>
-              </w:rPr>
-            </w:r>
           </w:p>
         </w:tc>
         <w:tc>
@@ -3374,13 +2885,6 @@
                 <w:szCs w:val="26"/>
               </w:rPr>
             </w:pPr>
-            <w:r>
-              <w:rPr>
-                <w:rFonts w:ascii="Times New Roman" w:hAnsi="Times New Roman" w:cs="Times New Roman"/>
-                <w:sz w:val="26"/>
-                <w:szCs w:val="26"/>
-              </w:rPr>
-            </w:r>
           </w:p>
         </w:tc>
         <w:tc>
@@ -3402,13 +2906,6 @@
                 <w:szCs w:val="26"/>
               </w:rPr>
             </w:pPr>
-            <w:r>
-              <w:rPr>
-                <w:rFonts w:ascii="Times New Roman" w:hAnsi="Times New Roman" w:cs="Times New Roman"/>
-                <w:sz w:val="26"/>
-                <w:szCs w:val="26"/>
-              </w:rPr>
-            </w:r>
           </w:p>
         </w:tc>
         <w:tc>
@@ -3430,13 +2927,6 @@
                 <w:szCs w:val="26"/>
               </w:rPr>
             </w:pPr>
-            <w:r>
-              <w:rPr>
-                <w:rFonts w:ascii="Times New Roman" w:hAnsi="Times New Roman" w:cs="Times New Roman"/>
-                <w:sz w:val="26"/>
-                <w:szCs w:val="26"/>
-              </w:rPr>
-            </w:r>
           </w:p>
         </w:tc>
       </w:tr>
@@ -3516,13 +3006,6 @@
                 <w:szCs w:val="26"/>
               </w:rPr>
             </w:pPr>
-            <w:r>
-              <w:rPr>
-                <w:rFonts w:ascii="Times New Roman" w:hAnsi="Times New Roman" w:cs="Times New Roman"/>
-                <w:sz w:val="26"/>
-                <w:szCs w:val="26"/>
-              </w:rPr>
-            </w:r>
           </w:p>
         </w:tc>
         <w:tc>
@@ -3544,13 +3027,6 @@
                 <w:szCs w:val="26"/>
               </w:rPr>
             </w:pPr>
-            <w:r>
-              <w:rPr>
-                <w:rFonts w:ascii="Times New Roman" w:hAnsi="Times New Roman" w:cs="Times New Roman"/>
-                <w:sz w:val="26"/>
-                <w:szCs w:val="26"/>
-              </w:rPr>
-            </w:r>
           </w:p>
         </w:tc>
         <w:tc>
@@ -3572,13 +3048,6 @@
                 <w:szCs w:val="26"/>
               </w:rPr>
             </w:pPr>
-            <w:r>
-              <w:rPr>
-                <w:rFonts w:ascii="Times New Roman" w:hAnsi="Times New Roman" w:cs="Times New Roman"/>
-                <w:sz w:val="26"/>
-                <w:szCs w:val="26"/>
-              </w:rPr>
-            </w:r>
           </w:p>
         </w:tc>
         <w:tc>
@@ -3600,13 +3069,6 @@
                 <w:szCs w:val="26"/>
               </w:rPr>
             </w:pPr>
-            <w:r>
-              <w:rPr>
-                <w:rFonts w:ascii="Times New Roman" w:hAnsi="Times New Roman" w:cs="Times New Roman"/>
-                <w:sz w:val="26"/>
-                <w:szCs w:val="26"/>
-              </w:rPr>
-            </w:r>
           </w:p>
         </w:tc>
         <w:tc>
@@ -3628,13 +3090,6 @@
                 <w:szCs w:val="26"/>
               </w:rPr>
             </w:pPr>
-            <w:r>
-              <w:rPr>
-                <w:rFonts w:ascii="Times New Roman" w:hAnsi="Times New Roman" w:cs="Times New Roman"/>
-                <w:sz w:val="26"/>
-                <w:szCs w:val="26"/>
-              </w:rPr>
-            </w:r>
           </w:p>
         </w:tc>
       </w:tr>
@@ -3714,12 +3169,6 @@
                 <w:szCs w:val="26"/>
               </w:rPr>
             </w:pPr>
-            <w:r>
-              <w:rPr>
-                <w:rFonts w:ascii="Times New Roman" w:hAnsi="Times New Roman"/>
-                <w:sz w:val="26"/>
-              </w:rPr>
-            </w:r>
           </w:p>
         </w:tc>
         <w:tc>
@@ -3741,12 +3190,6 @@
                 <w:szCs w:val="26"/>
               </w:rPr>
             </w:pPr>
-            <w:r>
-              <w:rPr>
-                <w:rFonts w:ascii="Times New Roman" w:hAnsi="Times New Roman"/>
-                <w:sz w:val="26"/>
-              </w:rPr>
-            </w:r>
           </w:p>
         </w:tc>
         <w:tc>
@@ -3768,12 +3211,6 @@
                 <w:szCs w:val="26"/>
               </w:rPr>
             </w:pPr>
-            <w:r>
-              <w:rPr>
-                <w:rFonts w:ascii="Times New Roman" w:hAnsi="Times New Roman"/>
-                <w:sz w:val="26"/>
-              </w:rPr>
-            </w:r>
           </w:p>
         </w:tc>
         <w:tc>
@@ -3795,12 +3232,6 @@
                 <w:szCs w:val="26"/>
               </w:rPr>
             </w:pPr>
-            <w:r>
-              <w:rPr>
-                <w:rFonts w:ascii="Times New Roman" w:hAnsi="Times New Roman"/>
-                <w:sz w:val="26"/>
-              </w:rPr>
-            </w:r>
           </w:p>
         </w:tc>
         <w:tc>
@@ -3822,12 +3253,6 @@
                 <w:szCs w:val="26"/>
               </w:rPr>
             </w:pPr>
-            <w:r>
-              <w:rPr>
-                <w:rFonts w:ascii="Times New Roman" w:hAnsi="Times New Roman"/>
-                <w:sz w:val="26"/>
-              </w:rPr>
-            </w:r>
           </w:p>
         </w:tc>
       </w:tr>
@@ -3907,13 +3332,6 @@
                 <w:szCs w:val="26"/>
               </w:rPr>
             </w:pPr>
-            <w:r>
-              <w:rPr>
-                <w:rFonts w:ascii="Times New Roman" w:hAnsi="Times New Roman" w:cs="Times New Roman"/>
-                <w:sz w:val="26"/>
-                <w:szCs w:val="26"/>
-              </w:rPr>
-            </w:r>
           </w:p>
         </w:tc>
         <w:tc>
@@ -3935,13 +3353,6 @@
                 <w:szCs w:val="26"/>
               </w:rPr>
             </w:pPr>
-            <w:r>
-              <w:rPr>
-                <w:rFonts w:ascii="Times New Roman" w:hAnsi="Times New Roman" w:cs="Times New Roman"/>
-                <w:sz w:val="26"/>
-                <w:szCs w:val="26"/>
-              </w:rPr>
-            </w:r>
           </w:p>
         </w:tc>
         <w:tc>
@@ -3963,13 +3374,6 @@
                 <w:szCs w:val="26"/>
               </w:rPr>
             </w:pPr>
-            <w:r>
-              <w:rPr>
-                <w:rFonts w:ascii="Times New Roman" w:hAnsi="Times New Roman" w:cs="Times New Roman"/>
-                <w:sz w:val="26"/>
-                <w:szCs w:val="26"/>
-              </w:rPr>
-            </w:r>
           </w:p>
         </w:tc>
         <w:tc>
@@ -3991,13 +3395,6 @@
                 <w:szCs w:val="26"/>
               </w:rPr>
             </w:pPr>
-            <w:r>
-              <w:rPr>
-                <w:rFonts w:ascii="Times New Roman" w:hAnsi="Times New Roman" w:cs="Times New Roman"/>
-                <w:sz w:val="26"/>
-                <w:szCs w:val="26"/>
-              </w:rPr>
-            </w:r>
           </w:p>
         </w:tc>
         <w:tc>
@@ -4019,13 +3416,6 @@
                 <w:szCs w:val="26"/>
               </w:rPr>
             </w:pPr>
-            <w:r>
-              <w:rPr>
-                <w:rFonts w:ascii="Times New Roman" w:hAnsi="Times New Roman" w:cs="Times New Roman"/>
-                <w:sz w:val="26"/>
-                <w:szCs w:val="26"/>
-              </w:rPr>
-            </w:r>
           </w:p>
         </w:tc>
       </w:tr>
@@ -4105,12 +3495,6 @@
                 <w:szCs w:val="26"/>
               </w:rPr>
             </w:pPr>
-            <w:r>
-              <w:rPr>
-                <w:rFonts w:ascii="Times New Roman" w:hAnsi="Times New Roman"/>
-                <w:sz w:val="26"/>
-              </w:rPr>
-            </w:r>
           </w:p>
         </w:tc>
         <w:tc>
@@ -4132,12 +3516,6 @@
                 <w:szCs w:val="26"/>
               </w:rPr>
             </w:pPr>
-            <w:r>
-              <w:rPr>
-                <w:rFonts w:ascii="Times New Roman" w:hAnsi="Times New Roman"/>
-                <w:sz w:val="26"/>
-              </w:rPr>
-            </w:r>
           </w:p>
         </w:tc>
         <w:tc>
@@ -4159,12 +3537,6 @@
                 <w:szCs w:val="26"/>
               </w:rPr>
             </w:pPr>
-            <w:r>
-              <w:rPr>
-                <w:rFonts w:ascii="Times New Roman" w:hAnsi="Times New Roman"/>
-                <w:sz w:val="26"/>
-              </w:rPr>
-            </w:r>
           </w:p>
         </w:tc>
         <w:tc>
@@ -4186,12 +3558,6 @@
                 <w:szCs w:val="26"/>
               </w:rPr>
             </w:pPr>
-            <w:r>
-              <w:rPr>
-                <w:rFonts w:ascii="Times New Roman" w:hAnsi="Times New Roman"/>
-                <w:sz w:val="26"/>
-              </w:rPr>
-            </w:r>
           </w:p>
         </w:tc>
         <w:tc>
@@ -4213,12 +3579,6 @@
                 <w:szCs w:val="26"/>
               </w:rPr>
             </w:pPr>
-            <w:r>
-              <w:rPr>
-                <w:rFonts w:ascii="Times New Roman" w:hAnsi="Times New Roman"/>
-                <w:sz w:val="26"/>
-              </w:rPr>
-            </w:r>
           </w:p>
         </w:tc>
       </w:tr>
@@ -4302,12 +3662,6 @@
                 <w:szCs w:val="26"/>
               </w:rPr>
             </w:pPr>
-            <w:r>
-              <w:rPr>
-                <w:rFonts w:ascii="Times New Roman" w:hAnsi="Times New Roman"/>
-                <w:sz w:val="26"/>
-              </w:rPr>
-            </w:r>
           </w:p>
         </w:tc>
         <w:tc>
@@ -4329,12 +3683,6 @@
                 <w:szCs w:val="26"/>
               </w:rPr>
             </w:pPr>
-            <w:r>
-              <w:rPr>
-                <w:rFonts w:ascii="Times New Roman" w:hAnsi="Times New Roman"/>
-                <w:sz w:val="26"/>
-              </w:rPr>
-            </w:r>
           </w:p>
         </w:tc>
         <w:tc>
@@ -4356,12 +3704,6 @@
                 <w:szCs w:val="26"/>
               </w:rPr>
             </w:pPr>
-            <w:r>
-              <w:rPr>
-                <w:rFonts w:ascii="Times New Roman" w:hAnsi="Times New Roman"/>
-                <w:sz w:val="26"/>
-              </w:rPr>
-            </w:r>
           </w:p>
         </w:tc>
         <w:tc>
@@ -4383,12 +3725,6 @@
                 <w:szCs w:val="26"/>
               </w:rPr>
             </w:pPr>
-            <w:r>
-              <w:rPr>
-                <w:rFonts w:ascii="Times New Roman" w:hAnsi="Times New Roman"/>
-                <w:sz w:val="26"/>
-              </w:rPr>
-            </w:r>
           </w:p>
         </w:tc>
         <w:tc>
@@ -4410,12 +3746,6 @@
                 <w:szCs w:val="26"/>
               </w:rPr>
             </w:pPr>
-            <w:r>
-              <w:rPr>
-                <w:rFonts w:ascii="Times New Roman" w:hAnsi="Times New Roman"/>
-                <w:sz w:val="26"/>
-              </w:rPr>
-            </w:r>
           </w:p>
         </w:tc>
       </w:tr>
@@ -4492,13 +3822,6 @@
                 <w:szCs w:val="26"/>
               </w:rPr>
             </w:pPr>
-            <w:r>
-              <w:rPr>
-                <w:rFonts w:ascii="Times New Roman" w:hAnsi="Times New Roman" w:cs="Times New Roman"/>
-                <w:sz w:val="26"/>
-                <w:szCs w:val="26"/>
-              </w:rPr>
-            </w:r>
           </w:p>
         </w:tc>
         <w:tc>
@@ -4520,13 +3843,6 @@
                 <w:szCs w:val="26"/>
               </w:rPr>
             </w:pPr>
-            <w:r>
-              <w:rPr>
-                <w:rFonts w:ascii="Times New Roman" w:hAnsi="Times New Roman" w:cs="Times New Roman"/>
-                <w:sz w:val="26"/>
-                <w:szCs w:val="26"/>
-              </w:rPr>
-            </w:r>
           </w:p>
         </w:tc>
         <w:tc>
@@ -4548,13 +3864,6 @@
                 <w:szCs w:val="26"/>
               </w:rPr>
             </w:pPr>
-            <w:r>
-              <w:rPr>
-                <w:rFonts w:ascii="Times New Roman" w:hAnsi="Times New Roman" w:cs="Times New Roman"/>
-                <w:sz w:val="26"/>
-                <w:szCs w:val="26"/>
-              </w:rPr>
-            </w:r>
           </w:p>
         </w:tc>
         <w:tc>
@@ -4576,13 +3885,6 @@
                 <w:szCs w:val="26"/>
               </w:rPr>
             </w:pPr>
-            <w:r>
-              <w:rPr>
-                <w:rFonts w:ascii="Times New Roman" w:hAnsi="Times New Roman" w:cs="Times New Roman"/>
-                <w:sz w:val="26"/>
-                <w:szCs w:val="26"/>
-              </w:rPr>
-            </w:r>
           </w:p>
         </w:tc>
         <w:tc>
@@ -4604,13 +3906,6 @@
                 <w:szCs w:val="26"/>
               </w:rPr>
             </w:pPr>
-            <w:r>
-              <w:rPr>
-                <w:rFonts w:ascii="Times New Roman" w:hAnsi="Times New Roman" w:cs="Times New Roman"/>
-                <w:sz w:val="26"/>
-                <w:szCs w:val="26"/>
-              </w:rPr>
-            </w:r>
           </w:p>
         </w:tc>
       </w:tr>
@@ -4687,13 +3982,6 @@
                 <w:szCs w:val="26"/>
               </w:rPr>
             </w:pPr>
-            <w:r>
-              <w:rPr>
-                <w:rFonts w:ascii="Times New Roman" w:hAnsi="Times New Roman" w:cs="Times New Roman"/>
-                <w:sz w:val="26"/>
-                <w:szCs w:val="26"/>
-              </w:rPr>
-            </w:r>
           </w:p>
         </w:tc>
         <w:tc>
@@ -4715,13 +4003,6 @@
                 <w:szCs w:val="26"/>
               </w:rPr>
             </w:pPr>
-            <w:r>
-              <w:rPr>
-                <w:rFonts w:ascii="Times New Roman" w:hAnsi="Times New Roman" w:cs="Times New Roman"/>
-                <w:sz w:val="26"/>
-                <w:szCs w:val="26"/>
-              </w:rPr>
-            </w:r>
           </w:p>
         </w:tc>
         <w:tc>
@@ -4743,13 +4024,6 @@
                 <w:szCs w:val="26"/>
               </w:rPr>
             </w:pPr>
-            <w:r>
-              <w:rPr>
-                <w:rFonts w:ascii="Times New Roman" w:hAnsi="Times New Roman" w:cs="Times New Roman"/>
-                <w:sz w:val="26"/>
-                <w:szCs w:val="26"/>
-              </w:rPr>
-            </w:r>
           </w:p>
         </w:tc>
         <w:tc>
@@ -4771,13 +4045,6 @@
                 <w:szCs w:val="26"/>
               </w:rPr>
             </w:pPr>
-            <w:r>
-              <w:rPr>
-                <w:rFonts w:ascii="Times New Roman" w:hAnsi="Times New Roman" w:cs="Times New Roman"/>
-                <w:sz w:val="26"/>
-                <w:szCs w:val="26"/>
-              </w:rPr>
-            </w:r>
           </w:p>
         </w:tc>
         <w:tc>
@@ -4799,13 +4066,6 @@
                 <w:szCs w:val="26"/>
               </w:rPr>
             </w:pPr>
-            <w:r>
-              <w:rPr>
-                <w:rFonts w:ascii="Times New Roman" w:hAnsi="Times New Roman" w:cs="Times New Roman"/>
-                <w:sz w:val="26"/>
-                <w:szCs w:val="26"/>
-              </w:rPr>
-            </w:r>
           </w:p>
         </w:tc>
       </w:tr>
@@ -5210,6 +4470,78 @@
         </w:tc>
       </w:tr>
     </w:tbl>
+    <w:p>
+      <w:pPr>
+        <w:spacing w:after="0" w:line="240" w:lineRule="auto"/>
+        <w:jc w:val="center"/>
+        <w:rPr>
+          <w:i/>
+        </w:rPr>
+      </w:pPr>
+    </w:p>
+    <w:p>
+      <w:pPr>
+        <w:spacing w:after="0" w:line="240" w:lineRule="auto"/>
+        <w:jc w:val="center"/>
+        <w:rPr>
+          <w:i/>
+        </w:rPr>
+      </w:pPr>
+    </w:p>
+    <w:p>
+      <w:pPr>
+        <w:spacing w:after="0" w:line="240" w:lineRule="auto"/>
+        <w:jc w:val="center"/>
+        <w:rPr>
+          <w:i/>
+        </w:rPr>
+      </w:pPr>
+    </w:p>
+    <w:p>
+      <w:pPr>
+        <w:spacing w:after="0" w:line="240" w:lineRule="auto"/>
+        <w:jc w:val="center"/>
+        <w:rPr>
+          <w:i/>
+        </w:rPr>
+      </w:pPr>
+    </w:p>
+    <w:p>
+      <w:pPr>
+        <w:spacing w:after="0" w:line="240" w:lineRule="auto"/>
+        <w:jc w:val="center"/>
+        <w:rPr>
+          <w:i/>
+        </w:rPr>
+      </w:pPr>
+    </w:p>
+    <w:p>
+      <w:pPr>
+        <w:spacing w:after="0" w:line="240" w:lineRule="auto"/>
+        <w:jc w:val="center"/>
+        <w:rPr>
+          <w:i/>
+        </w:rPr>
+      </w:pPr>
+    </w:p>
+    <w:p>
+      <w:pPr>
+        <w:spacing w:after="0" w:line="240" w:lineRule="auto"/>
+        <w:jc w:val="center"/>
+        <w:rPr>
+          <w:i/>
+        </w:rPr>
+      </w:pPr>
+    </w:p>
+    <w:p>
+      <w:pPr>
+        <w:spacing w:after="0" w:line="240" w:lineRule="auto"/>
+        <w:jc w:val="center"/>
+        <w:rPr>
+          <w:i/>
+        </w:rPr>
+      </w:pPr>
+    </w:p>
     <w:p>
       <w:pPr>
         <w:spacing w:after="0" w:line="240" w:lineRule="auto"/>
@@ -5234,131 +4566,6 @@
         </w:rPr>
       </w:pPr>
     </w:p>
-    <w:tbl>
-      <w:tblPr>
-        <w:tblStyle w:val="TableGrid"/>
-        <w:tblW w:w="0" w:type="auto"/>
-        <w:tblBorders>
-          <w:top w:val="none" w:sz="0" w:space="0" w:color="auto"/>
-          <w:left w:val="none" w:sz="0" w:space="0" w:color="auto"/>
-          <w:bottom w:val="none" w:sz="0" w:space="0" w:color="auto"/>
-          <w:right w:val="none" w:sz="0" w:space="0" w:color="auto"/>
-          <w:insideH w:val="none" w:sz="0" w:space="0" w:color="auto"/>
-          <w:insideV w:val="none" w:sz="0" w:space="0" w:color="auto"/>
-        </w:tblBorders>
-        <w:tblLook w:val="04A0" w:firstRow="1" w:lastRow="0" w:firstColumn="1" w:lastColumn="0" w:noHBand="0" w:noVBand="1"/>
-      </w:tblPr>
-      <w:tblGrid>
-        <w:gridCol w:w="6716"/>
-        <w:gridCol w:w="3294"/>
-      </w:tblGrid>
-      <w:tr>
-        <w:tc>
-          <w:tcPr>
-            <w:tcW w:w="6091" w:type="dxa"/>
-          </w:tcPr>
-          <w:p>
-            <w:pPr>
-              <w:rPr>
-                <w:rFonts w:ascii="Times New Roman" w:hAnsi="Times New Roman" w:cs="Times New Roman"/>
-                <w:sz w:val="26"/>
-                <w:szCs w:val="26"/>
-              </w:rPr>
-            </w:pPr>
-            <w:r>
-              <w:rPr>
-                <w:rFonts w:ascii="Times New Roman" w:hAnsi="Times New Roman" w:cs="Times New Roman"/>
-                <w:sz w:val="26"/>
-                <w:szCs w:val="26"/>
-              </w:rPr>
-              <w:t>Kiểm tra, nhận xét</w:t>
-            </w:r>
-            <w:r>
-              <w:rPr>
-                <w:rFonts w:ascii="Times New Roman" w:hAnsi="Times New Roman" w:cs="Times New Roman"/>
-                <w:sz w:val="26"/>
-                <w:szCs w:val="26"/>
-              </w:rPr>
-              <w:br/>
-              <w:t>…………………………………………………………………</w:t>
-            </w:r>
-            <w:r>
-              <w:rPr>
-                <w:rFonts w:ascii="Times New Roman" w:hAnsi="Times New Roman" w:cs="Times New Roman"/>
-                <w:sz w:val="26"/>
-                <w:szCs w:val="26"/>
-              </w:rPr>
-              <w:br/>
-              <w:t>…………………………………………………………………</w:t>
-            </w:r>
-            <w:r>
-              <w:rPr>
-                <w:rFonts w:ascii="Times New Roman" w:hAnsi="Times New Roman" w:cs="Times New Roman"/>
-                <w:sz w:val="26"/>
-                <w:szCs w:val="26"/>
-              </w:rPr>
-              <w:br/>
-              <w:t>…………………………………………………………………</w:t>
-            </w:r>
-            <w:r>
-              <w:rPr>
-                <w:rFonts w:ascii="Times New Roman" w:hAnsi="Times New Roman" w:cs="Times New Roman"/>
-                <w:sz w:val="26"/>
-                <w:szCs w:val="26"/>
-              </w:rPr>
-              <w:br/>
-              <w:t>…………………………………………………………………</w:t>
-            </w:r>
-          </w:p>
-        </w:tc>
-        <w:tc>
-          <w:tcPr>
-            <w:tcW w:w="3909" w:type="dxa"/>
-          </w:tcPr>
-          <w:p>
-            <w:pPr>
-              <w:jc w:val="center"/>
-              <w:rPr>
-                <w:rFonts w:ascii="Times New Roman" w:hAnsi="Times New Roman" w:cs="Times New Roman"/>
-                <w:sz w:val="26"/>
-                <w:szCs w:val="26"/>
-              </w:rPr>
-            </w:pPr>
-            <w:r>
-              <w:rPr>
-                <w:rFonts w:ascii="Times New Roman" w:hAnsi="Times New Roman"/>
-                <w:sz w:val="26"/>
-              </w:rPr>
-              <w:t>Ngày 18 tháng 9 năm 2026</w:t>
-              <w:br/>
-            </w:r>
-            <w:r>
-              <w:rPr>
-                <w:rFonts w:ascii="Times New Roman" w:hAnsi="Times New Roman"/>
-                <w:sz w:val="26"/>
-              </w:rPr>
-              <w:t>Tổ trưởng</w:t>
-              <w:br/>
-              <w:br/>
-              <w:br/>
-              <w:br/>
-            </w:r>
-            <w:r>
-              <w:rPr>
-                <w:rFonts w:ascii="Times New Roman" w:hAnsi="Times New Roman"/>
-                <w:sz w:val="26"/>
-              </w:rPr>
-              <w:t>Nguyễn Thị Ngọc Ánh</w:t>
-            </w:r>
-          </w:p>
-        </w:tc>
-      </w:tr>
-    </w:tbl>
-    <w:p>
-      <w:r>
-        <w:br w:type="page"/>
-      </w:r>
-    </w:p>
     <w:p>
       <w:pPr>
         <w:spacing w:after="0" w:line="240" w:lineRule="auto"/>
@@ -5370,6 +4577,7 @@
         <w:rPr>
           <w:i/>
         </w:rPr>
+        <w:lastRenderedPageBreak/>
         <w:t>Buổi…chiều…..Tuần…08…(Từ ngày…21/09/2026…đến ngày:… 25/09/2026….)</w:t>
       </w:r>
     </w:p>
@@ -5728,12 +4936,6 @@
                 <w:szCs w:val="26"/>
               </w:rPr>
             </w:pPr>
-            <w:r>
-              <w:rPr>
-                <w:rFonts w:ascii="Times New Roman" w:hAnsi="Times New Roman"/>
-                <w:sz w:val="26"/>
-              </w:rPr>
-            </w:r>
           </w:p>
         </w:tc>
         <w:tc>
@@ -5755,12 +4957,6 @@
                 <w:szCs w:val="26"/>
               </w:rPr>
             </w:pPr>
-            <w:r>
-              <w:rPr>
-                <w:rFonts w:ascii="Times New Roman" w:hAnsi="Times New Roman"/>
-                <w:sz w:val="26"/>
-              </w:rPr>
-            </w:r>
           </w:p>
         </w:tc>
         <w:tc>
@@ -5782,12 +4978,6 @@
                 <w:szCs w:val="26"/>
               </w:rPr>
             </w:pPr>
-            <w:r>
-              <w:rPr>
-                <w:rFonts w:ascii="Times New Roman" w:hAnsi="Times New Roman"/>
-                <w:sz w:val="26"/>
-              </w:rPr>
-            </w:r>
           </w:p>
         </w:tc>
         <w:tc>
@@ -5809,12 +4999,6 @@
                 <w:szCs w:val="26"/>
               </w:rPr>
             </w:pPr>
-            <w:r>
-              <w:rPr>
-                <w:rFonts w:ascii="Times New Roman" w:hAnsi="Times New Roman"/>
-                <w:sz w:val="26"/>
-              </w:rPr>
-            </w:r>
           </w:p>
         </w:tc>
         <w:tc>
@@ -5836,12 +5020,6 @@
                 <w:szCs w:val="26"/>
               </w:rPr>
             </w:pPr>
-            <w:r>
-              <w:rPr>
-                <w:rFonts w:ascii="Times New Roman" w:hAnsi="Times New Roman"/>
-                <w:sz w:val="26"/>
-              </w:rPr>
-            </w:r>
           </w:p>
         </w:tc>
       </w:tr>
@@ -5919,12 +5097,6 @@
                 <w:szCs w:val="26"/>
               </w:rPr>
             </w:pPr>
-            <w:r>
-              <w:rPr>
-                <w:rFonts w:ascii="Times New Roman" w:hAnsi="Times New Roman"/>
-                <w:sz w:val="26"/>
-              </w:rPr>
-            </w:r>
           </w:p>
         </w:tc>
         <w:tc>
@@ -5946,12 +5118,6 @@
                 <w:szCs w:val="26"/>
               </w:rPr>
             </w:pPr>
-            <w:r>
-              <w:rPr>
-                <w:rFonts w:ascii="Times New Roman" w:hAnsi="Times New Roman"/>
-                <w:sz w:val="26"/>
-              </w:rPr>
-            </w:r>
           </w:p>
         </w:tc>
         <w:tc>
@@ -5973,12 +5139,6 @@
                 <w:szCs w:val="26"/>
               </w:rPr>
             </w:pPr>
-            <w:r>
-              <w:rPr>
-                <w:rFonts w:ascii="Times New Roman" w:hAnsi="Times New Roman"/>
-                <w:sz w:val="26"/>
-              </w:rPr>
-            </w:r>
           </w:p>
         </w:tc>
         <w:tc>
@@ -6000,12 +5160,6 @@
                 <w:szCs w:val="26"/>
               </w:rPr>
             </w:pPr>
-            <w:r>
-              <w:rPr>
-                <w:rFonts w:ascii="Times New Roman" w:hAnsi="Times New Roman"/>
-                <w:sz w:val="26"/>
-              </w:rPr>
-            </w:r>
           </w:p>
         </w:tc>
         <w:tc>
@@ -6027,12 +5181,6 @@
                 <w:szCs w:val="26"/>
               </w:rPr>
             </w:pPr>
-            <w:r>
-              <w:rPr>
-                <w:rFonts w:ascii="Times New Roman" w:hAnsi="Times New Roman"/>
-                <w:sz w:val="26"/>
-              </w:rPr>
-            </w:r>
           </w:p>
         </w:tc>
       </w:tr>
@@ -6110,12 +5258,6 @@
                 <w:szCs w:val="26"/>
               </w:rPr>
             </w:pPr>
-            <w:r>
-              <w:rPr>
-                <w:rFonts w:ascii="Times New Roman" w:hAnsi="Times New Roman"/>
-                <w:sz w:val="26"/>
-              </w:rPr>
-            </w:r>
           </w:p>
         </w:tc>
         <w:tc>
@@ -6137,12 +5279,6 @@
                 <w:szCs w:val="26"/>
               </w:rPr>
             </w:pPr>
-            <w:r>
-              <w:rPr>
-                <w:rFonts w:ascii="Times New Roman" w:hAnsi="Times New Roman"/>
-                <w:sz w:val="26"/>
-              </w:rPr>
-            </w:r>
           </w:p>
         </w:tc>
         <w:tc>
@@ -6164,12 +5300,6 @@
                 <w:szCs w:val="26"/>
               </w:rPr>
             </w:pPr>
-            <w:r>
-              <w:rPr>
-                <w:rFonts w:ascii="Times New Roman" w:hAnsi="Times New Roman"/>
-                <w:sz w:val="26"/>
-              </w:rPr>
-            </w:r>
           </w:p>
         </w:tc>
         <w:tc>
@@ -6191,12 +5321,6 @@
                 <w:szCs w:val="26"/>
               </w:rPr>
             </w:pPr>
-            <w:r>
-              <w:rPr>
-                <w:rFonts w:ascii="Times New Roman" w:hAnsi="Times New Roman"/>
-                <w:sz w:val="26"/>
-              </w:rPr>
-            </w:r>
           </w:p>
         </w:tc>
         <w:tc>
@@ -6218,12 +5342,6 @@
                 <w:szCs w:val="26"/>
               </w:rPr>
             </w:pPr>
-            <w:r>
-              <w:rPr>
-                <w:rFonts w:ascii="Times New Roman" w:hAnsi="Times New Roman"/>
-                <w:sz w:val="26"/>
-              </w:rPr>
-            </w:r>
           </w:p>
         </w:tc>
       </w:tr>
@@ -6301,12 +5419,6 @@
                 <w:szCs w:val="26"/>
               </w:rPr>
             </w:pPr>
-            <w:r>
-              <w:rPr>
-                <w:rFonts w:ascii="Times New Roman" w:hAnsi="Times New Roman"/>
-                <w:sz w:val="26"/>
-              </w:rPr>
-            </w:r>
           </w:p>
         </w:tc>
         <w:tc>
@@ -6328,12 +5440,6 @@
                 <w:szCs w:val="26"/>
               </w:rPr>
             </w:pPr>
-            <w:r>
-              <w:rPr>
-                <w:rFonts w:ascii="Times New Roman" w:hAnsi="Times New Roman"/>
-                <w:sz w:val="26"/>
-              </w:rPr>
-            </w:r>
           </w:p>
         </w:tc>
         <w:tc>
@@ -6355,12 +5461,6 @@
                 <w:szCs w:val="26"/>
               </w:rPr>
             </w:pPr>
-            <w:r>
-              <w:rPr>
-                <w:rFonts w:ascii="Times New Roman" w:hAnsi="Times New Roman"/>
-                <w:sz w:val="26"/>
-              </w:rPr>
-            </w:r>
           </w:p>
         </w:tc>
         <w:tc>
@@ -6382,12 +5482,6 @@
                 <w:szCs w:val="26"/>
               </w:rPr>
             </w:pPr>
-            <w:r>
-              <w:rPr>
-                <w:rFonts w:ascii="Times New Roman" w:hAnsi="Times New Roman"/>
-                <w:sz w:val="26"/>
-              </w:rPr>
-            </w:r>
           </w:p>
         </w:tc>
         <w:tc>
@@ -6409,12 +5503,6 @@
                 <w:szCs w:val="26"/>
               </w:rPr>
             </w:pPr>
-            <w:r>
-              <w:rPr>
-                <w:rFonts w:ascii="Times New Roman" w:hAnsi="Times New Roman"/>
-                <w:sz w:val="26"/>
-              </w:rPr>
-            </w:r>
           </w:p>
         </w:tc>
       </w:tr>
@@ -6492,12 +5580,6 @@
                 <w:szCs w:val="26"/>
               </w:rPr>
             </w:pPr>
-            <w:r>
-              <w:rPr>
-                <w:rFonts w:ascii="Times New Roman" w:hAnsi="Times New Roman"/>
-                <w:sz w:val="26"/>
-              </w:rPr>
-            </w:r>
           </w:p>
         </w:tc>
         <w:tc>
@@ -6519,12 +5601,6 @@
                 <w:szCs w:val="26"/>
               </w:rPr>
             </w:pPr>
-            <w:r>
-              <w:rPr>
-                <w:rFonts w:ascii="Times New Roman" w:hAnsi="Times New Roman"/>
-                <w:sz w:val="26"/>
-              </w:rPr>
-            </w:r>
           </w:p>
         </w:tc>
         <w:tc>
@@ -6546,12 +5622,6 @@
                 <w:szCs w:val="26"/>
               </w:rPr>
             </w:pPr>
-            <w:r>
-              <w:rPr>
-                <w:rFonts w:ascii="Times New Roman" w:hAnsi="Times New Roman"/>
-                <w:sz w:val="26"/>
-              </w:rPr>
-            </w:r>
           </w:p>
         </w:tc>
         <w:tc>
@@ -6573,12 +5643,6 @@
                 <w:szCs w:val="26"/>
               </w:rPr>
             </w:pPr>
-            <w:r>
-              <w:rPr>
-                <w:rFonts w:ascii="Times New Roman" w:hAnsi="Times New Roman"/>
-                <w:sz w:val="26"/>
-              </w:rPr>
-            </w:r>
           </w:p>
         </w:tc>
         <w:tc>
@@ -6600,12 +5664,6 @@
                 <w:szCs w:val="26"/>
               </w:rPr>
             </w:pPr>
-            <w:r>
-              <w:rPr>
-                <w:rFonts w:ascii="Times New Roman" w:hAnsi="Times New Roman"/>
-                <w:sz w:val="26"/>
-              </w:rPr>
-            </w:r>
           </w:p>
         </w:tc>
       </w:tr>
@@ -6689,13 +5747,6 @@
                 <w:szCs w:val="26"/>
               </w:rPr>
             </w:pPr>
-            <w:r>
-              <w:rPr>
-                <w:rFonts w:ascii="Times New Roman" w:hAnsi="Times New Roman" w:cs="Times New Roman"/>
-                <w:sz w:val="26"/>
-                <w:szCs w:val="26"/>
-              </w:rPr>
-            </w:r>
           </w:p>
         </w:tc>
         <w:tc>
@@ -6717,13 +5768,6 @@
                 <w:szCs w:val="26"/>
               </w:rPr>
             </w:pPr>
-            <w:r>
-              <w:rPr>
-                <w:rFonts w:ascii="Times New Roman" w:hAnsi="Times New Roman" w:cs="Times New Roman"/>
-                <w:sz w:val="26"/>
-                <w:szCs w:val="26"/>
-              </w:rPr>
-            </w:r>
           </w:p>
         </w:tc>
         <w:tc>
@@ -6745,13 +5789,6 @@
                 <w:szCs w:val="26"/>
               </w:rPr>
             </w:pPr>
-            <w:r>
-              <w:rPr>
-                <w:rFonts w:ascii="Times New Roman" w:hAnsi="Times New Roman" w:cs="Times New Roman"/>
-                <w:sz w:val="26"/>
-                <w:szCs w:val="26"/>
-              </w:rPr>
-            </w:r>
           </w:p>
         </w:tc>
         <w:tc>
@@ -6773,13 +5810,6 @@
                 <w:szCs w:val="26"/>
               </w:rPr>
             </w:pPr>
-            <w:r>
-              <w:rPr>
-                <w:rFonts w:ascii="Times New Roman" w:hAnsi="Times New Roman" w:cs="Times New Roman"/>
-                <w:sz w:val="26"/>
-                <w:szCs w:val="26"/>
-              </w:rPr>
-            </w:r>
           </w:p>
         </w:tc>
         <w:tc>
@@ -6801,13 +5831,6 @@
                 <w:szCs w:val="26"/>
               </w:rPr>
             </w:pPr>
-            <w:r>
-              <w:rPr>
-                <w:rFonts w:ascii="Times New Roman" w:hAnsi="Times New Roman" w:cs="Times New Roman"/>
-                <w:sz w:val="26"/>
-                <w:szCs w:val="26"/>
-              </w:rPr>
-            </w:r>
           </w:p>
         </w:tc>
       </w:tr>
@@ -6887,13 +5910,6 @@
                 <w:szCs w:val="26"/>
               </w:rPr>
             </w:pPr>
-            <w:r>
-              <w:rPr>
-                <w:rFonts w:ascii="Times New Roman" w:hAnsi="Times New Roman" w:cs="Times New Roman"/>
-                <w:sz w:val="26"/>
-                <w:szCs w:val="26"/>
-              </w:rPr>
-            </w:r>
           </w:p>
         </w:tc>
         <w:tc>
@@ -6915,13 +5931,6 @@
                 <w:szCs w:val="26"/>
               </w:rPr>
             </w:pPr>
-            <w:r>
-              <w:rPr>
-                <w:rFonts w:ascii="Times New Roman" w:hAnsi="Times New Roman" w:cs="Times New Roman"/>
-                <w:sz w:val="26"/>
-                <w:szCs w:val="26"/>
-              </w:rPr>
-            </w:r>
           </w:p>
         </w:tc>
         <w:tc>
@@ -6943,13 +5952,6 @@
                 <w:szCs w:val="26"/>
               </w:rPr>
             </w:pPr>
-            <w:r>
-              <w:rPr>
-                <w:rFonts w:ascii="Times New Roman" w:hAnsi="Times New Roman" w:cs="Times New Roman"/>
-                <w:sz w:val="26"/>
-                <w:szCs w:val="26"/>
-              </w:rPr>
-            </w:r>
           </w:p>
         </w:tc>
         <w:tc>
@@ -6971,13 +5973,6 @@
                 <w:szCs w:val="26"/>
               </w:rPr>
             </w:pPr>
-            <w:r>
-              <w:rPr>
-                <w:rFonts w:ascii="Times New Roman" w:hAnsi="Times New Roman" w:cs="Times New Roman"/>
-                <w:sz w:val="26"/>
-                <w:szCs w:val="26"/>
-              </w:rPr>
-            </w:r>
           </w:p>
         </w:tc>
         <w:tc>
@@ -6999,13 +5994,6 @@
                 <w:szCs w:val="26"/>
               </w:rPr>
             </w:pPr>
-            <w:r>
-              <w:rPr>
-                <w:rFonts w:ascii="Times New Roman" w:hAnsi="Times New Roman" w:cs="Times New Roman"/>
-                <w:sz w:val="26"/>
-                <w:szCs w:val="26"/>
-              </w:rPr>
-            </w:r>
           </w:p>
         </w:tc>
       </w:tr>
@@ -7491,12 +6479,6 @@
                 <w:szCs w:val="26"/>
               </w:rPr>
             </w:pPr>
-            <w:r>
-              <w:rPr>
-                <w:rFonts w:ascii="Times New Roman" w:hAnsi="Times New Roman"/>
-                <w:sz w:val="26"/>
-              </w:rPr>
-            </w:r>
           </w:p>
         </w:tc>
         <w:tc>
@@ -7518,12 +6500,6 @@
                 <w:szCs w:val="26"/>
               </w:rPr>
             </w:pPr>
-            <w:r>
-              <w:rPr>
-                <w:rFonts w:ascii="Times New Roman" w:hAnsi="Times New Roman"/>
-                <w:sz w:val="26"/>
-              </w:rPr>
-            </w:r>
           </w:p>
         </w:tc>
         <w:tc>
@@ -7545,12 +6521,6 @@
                 <w:szCs w:val="26"/>
               </w:rPr>
             </w:pPr>
-            <w:r>
-              <w:rPr>
-                <w:rFonts w:ascii="Times New Roman" w:hAnsi="Times New Roman"/>
-                <w:sz w:val="26"/>
-              </w:rPr>
-            </w:r>
           </w:p>
         </w:tc>
         <w:tc>
@@ -7572,12 +6542,6 @@
                 <w:szCs w:val="26"/>
               </w:rPr>
             </w:pPr>
-            <w:r>
-              <w:rPr>
-                <w:rFonts w:ascii="Times New Roman" w:hAnsi="Times New Roman"/>
-                <w:sz w:val="26"/>
-              </w:rPr>
-            </w:r>
           </w:p>
         </w:tc>
         <w:tc>
@@ -7599,12 +6563,6 @@
                 <w:szCs w:val="26"/>
               </w:rPr>
             </w:pPr>
-            <w:r>
-              <w:rPr>
-                <w:rFonts w:ascii="Times New Roman" w:hAnsi="Times New Roman"/>
-                <w:sz w:val="26"/>
-              </w:rPr>
-            </w:r>
           </w:p>
         </w:tc>
       </w:tr>
@@ -7688,12 +6646,6 @@
                 <w:szCs w:val="26"/>
               </w:rPr>
             </w:pPr>
-            <w:r>
-              <w:rPr>
-                <w:rFonts w:ascii="Times New Roman" w:hAnsi="Times New Roman"/>
-                <w:sz w:val="26"/>
-              </w:rPr>
-            </w:r>
           </w:p>
         </w:tc>
         <w:tc>
@@ -7715,12 +6667,6 @@
                 <w:szCs w:val="26"/>
               </w:rPr>
             </w:pPr>
-            <w:r>
-              <w:rPr>
-                <w:rFonts w:ascii="Times New Roman" w:hAnsi="Times New Roman"/>
-                <w:sz w:val="26"/>
-              </w:rPr>
-            </w:r>
           </w:p>
         </w:tc>
         <w:tc>
@@ -7742,12 +6688,6 @@
                 <w:szCs w:val="26"/>
               </w:rPr>
             </w:pPr>
-            <w:r>
-              <w:rPr>
-                <w:rFonts w:ascii="Times New Roman" w:hAnsi="Times New Roman"/>
-                <w:sz w:val="26"/>
-              </w:rPr>
-            </w:r>
           </w:p>
         </w:tc>
         <w:tc>
@@ -7769,12 +6709,6 @@
                 <w:szCs w:val="26"/>
               </w:rPr>
             </w:pPr>
-            <w:r>
-              <w:rPr>
-                <w:rFonts w:ascii="Times New Roman" w:hAnsi="Times New Roman"/>
-                <w:sz w:val="26"/>
-              </w:rPr>
-            </w:r>
           </w:p>
         </w:tc>
         <w:tc>
@@ -7796,12 +6730,6 @@
                 <w:szCs w:val="26"/>
               </w:rPr>
             </w:pPr>
-            <w:r>
-              <w:rPr>
-                <w:rFonts w:ascii="Times New Roman" w:hAnsi="Times New Roman"/>
-                <w:sz w:val="26"/>
-              </w:rPr>
-            </w:r>
           </w:p>
         </w:tc>
       </w:tr>
@@ -7881,12 +6809,6 @@
                 <w:szCs w:val="26"/>
               </w:rPr>
             </w:pPr>
-            <w:r>
-              <w:rPr>
-                <w:rFonts w:ascii="Times New Roman" w:hAnsi="Times New Roman"/>
-                <w:sz w:val="26"/>
-              </w:rPr>
-            </w:r>
           </w:p>
         </w:tc>
         <w:tc>
@@ -7908,12 +6830,6 @@
                 <w:szCs w:val="26"/>
               </w:rPr>
             </w:pPr>
-            <w:r>
-              <w:rPr>
-                <w:rFonts w:ascii="Times New Roman" w:hAnsi="Times New Roman"/>
-                <w:sz w:val="26"/>
-              </w:rPr>
-            </w:r>
           </w:p>
         </w:tc>
         <w:tc>
@@ -7935,12 +6851,6 @@
                 <w:szCs w:val="26"/>
               </w:rPr>
             </w:pPr>
-            <w:r>
-              <w:rPr>
-                <w:rFonts w:ascii="Times New Roman" w:hAnsi="Times New Roman"/>
-                <w:sz w:val="26"/>
-              </w:rPr>
-            </w:r>
           </w:p>
         </w:tc>
         <w:tc>
@@ -7962,12 +6872,6 @@
                 <w:szCs w:val="26"/>
               </w:rPr>
             </w:pPr>
-            <w:r>
-              <w:rPr>
-                <w:rFonts w:ascii="Times New Roman" w:hAnsi="Times New Roman"/>
-                <w:sz w:val="26"/>
-              </w:rPr>
-            </w:r>
           </w:p>
         </w:tc>
         <w:tc>
@@ -7989,12 +6893,6 @@
                 <w:szCs w:val="26"/>
               </w:rPr>
             </w:pPr>
-            <w:r>
-              <w:rPr>
-                <w:rFonts w:ascii="Times New Roman" w:hAnsi="Times New Roman"/>
-                <w:sz w:val="26"/>
-              </w:rPr>
-            </w:r>
           </w:p>
         </w:tc>
       </w:tr>
@@ -8074,13 +6972,6 @@
                 <w:szCs w:val="26"/>
               </w:rPr>
             </w:pPr>
-            <w:r>
-              <w:rPr>
-                <w:rFonts w:ascii="Times New Roman" w:hAnsi="Times New Roman" w:cs="Times New Roman"/>
-                <w:sz w:val="26"/>
-                <w:szCs w:val="26"/>
-              </w:rPr>
-            </w:r>
           </w:p>
         </w:tc>
         <w:tc>
@@ -8102,13 +6993,6 @@
                 <w:szCs w:val="26"/>
               </w:rPr>
             </w:pPr>
-            <w:r>
-              <w:rPr>
-                <w:rFonts w:ascii="Times New Roman" w:hAnsi="Times New Roman" w:cs="Times New Roman"/>
-                <w:sz w:val="26"/>
-                <w:szCs w:val="26"/>
-              </w:rPr>
-            </w:r>
           </w:p>
         </w:tc>
         <w:tc>
@@ -8130,13 +7014,6 @@
                 <w:szCs w:val="26"/>
               </w:rPr>
             </w:pPr>
-            <w:r>
-              <w:rPr>
-                <w:rFonts w:ascii="Times New Roman" w:hAnsi="Times New Roman" w:cs="Times New Roman"/>
-                <w:sz w:val="26"/>
-                <w:szCs w:val="26"/>
-              </w:rPr>
-            </w:r>
           </w:p>
         </w:tc>
         <w:tc>
@@ -8158,13 +7035,6 @@
                 <w:szCs w:val="26"/>
               </w:rPr>
             </w:pPr>
-            <w:r>
-              <w:rPr>
-                <w:rFonts w:ascii="Times New Roman" w:hAnsi="Times New Roman" w:cs="Times New Roman"/>
-                <w:sz w:val="26"/>
-                <w:szCs w:val="26"/>
-              </w:rPr>
-            </w:r>
           </w:p>
         </w:tc>
         <w:tc>
@@ -8186,13 +7056,6 @@
                 <w:szCs w:val="26"/>
               </w:rPr>
             </w:pPr>
-            <w:r>
-              <w:rPr>
-                <w:rFonts w:ascii="Times New Roman" w:hAnsi="Times New Roman" w:cs="Times New Roman"/>
-                <w:sz w:val="26"/>
-                <w:szCs w:val="26"/>
-              </w:rPr>
-            </w:r>
           </w:p>
         </w:tc>
       </w:tr>
@@ -8272,13 +7135,6 @@
                 <w:szCs w:val="26"/>
               </w:rPr>
             </w:pPr>
-            <w:r>
-              <w:rPr>
-                <w:rFonts w:ascii="Times New Roman" w:hAnsi="Times New Roman" w:cs="Times New Roman"/>
-                <w:sz w:val="26"/>
-                <w:szCs w:val="26"/>
-              </w:rPr>
-            </w:r>
           </w:p>
         </w:tc>
         <w:tc>
@@ -8300,13 +7156,6 @@
                 <w:szCs w:val="26"/>
               </w:rPr>
             </w:pPr>
-            <w:r>
-              <w:rPr>
-                <w:rFonts w:ascii="Times New Roman" w:hAnsi="Times New Roman" w:cs="Times New Roman"/>
-                <w:sz w:val="26"/>
-                <w:szCs w:val="26"/>
-              </w:rPr>
-            </w:r>
           </w:p>
         </w:tc>
         <w:tc>
@@ -8328,13 +7177,6 @@
                 <w:szCs w:val="26"/>
               </w:rPr>
             </w:pPr>
-            <w:r>
-              <w:rPr>
-                <w:rFonts w:ascii="Times New Roman" w:hAnsi="Times New Roman" w:cs="Times New Roman"/>
-                <w:sz w:val="26"/>
-                <w:szCs w:val="26"/>
-              </w:rPr>
-            </w:r>
           </w:p>
         </w:tc>
         <w:tc>
@@ -8356,13 +7198,6 @@
                 <w:szCs w:val="26"/>
               </w:rPr>
             </w:pPr>
-            <w:r>
-              <w:rPr>
-                <w:rFonts w:ascii="Times New Roman" w:hAnsi="Times New Roman" w:cs="Times New Roman"/>
-                <w:sz w:val="26"/>
-                <w:szCs w:val="26"/>
-              </w:rPr>
-            </w:r>
           </w:p>
         </w:tc>
         <w:tc>
@@ -8384,13 +7219,6 @@
                 <w:szCs w:val="26"/>
               </w:rPr>
             </w:pPr>
-            <w:r>
-              <w:rPr>
-                <w:rFonts w:ascii="Times New Roman" w:hAnsi="Times New Roman" w:cs="Times New Roman"/>
-                <w:sz w:val="26"/>
-                <w:szCs w:val="26"/>
-              </w:rPr>
-            </w:r>
           </w:p>
         </w:tc>
       </w:tr>
@@ -8470,12 +7298,6 @@
                 <w:szCs w:val="26"/>
               </w:rPr>
             </w:pPr>
-            <w:r>
-              <w:rPr>
-                <w:rFonts w:ascii="Times New Roman" w:hAnsi="Times New Roman"/>
-                <w:sz w:val="26"/>
-              </w:rPr>
-            </w:r>
           </w:p>
         </w:tc>
         <w:tc>
@@ -8497,12 +7319,6 @@
                 <w:szCs w:val="26"/>
               </w:rPr>
             </w:pPr>
-            <w:r>
-              <w:rPr>
-                <w:rFonts w:ascii="Times New Roman" w:hAnsi="Times New Roman"/>
-                <w:sz w:val="26"/>
-              </w:rPr>
-            </w:r>
           </w:p>
         </w:tc>
         <w:tc>
@@ -8524,12 +7340,6 @@
                 <w:szCs w:val="26"/>
               </w:rPr>
             </w:pPr>
-            <w:r>
-              <w:rPr>
-                <w:rFonts w:ascii="Times New Roman" w:hAnsi="Times New Roman"/>
-                <w:sz w:val="26"/>
-              </w:rPr>
-            </w:r>
           </w:p>
         </w:tc>
         <w:tc>
@@ -8551,12 +7361,6 @@
                 <w:szCs w:val="26"/>
               </w:rPr>
             </w:pPr>
-            <w:r>
-              <w:rPr>
-                <w:rFonts w:ascii="Times New Roman" w:hAnsi="Times New Roman"/>
-                <w:sz w:val="26"/>
-              </w:rPr>
-            </w:r>
           </w:p>
         </w:tc>
         <w:tc>
@@ -8578,12 +7382,6 @@
                 <w:szCs w:val="26"/>
               </w:rPr>
             </w:pPr>
-            <w:r>
-              <w:rPr>
-                <w:rFonts w:ascii="Times New Roman" w:hAnsi="Times New Roman"/>
-                <w:sz w:val="26"/>
-              </w:rPr>
-            </w:r>
           </w:p>
         </w:tc>
       </w:tr>
@@ -8667,13 +7465,6 @@
                 <w:szCs w:val="26"/>
               </w:rPr>
             </w:pPr>
-            <w:r>
-              <w:rPr>
-                <w:rFonts w:ascii="Times New Roman" w:hAnsi="Times New Roman" w:cs="Times New Roman"/>
-                <w:sz w:val="26"/>
-                <w:szCs w:val="26"/>
-              </w:rPr>
-            </w:r>
           </w:p>
         </w:tc>
         <w:tc>
@@ -8695,13 +7486,6 @@
                 <w:szCs w:val="26"/>
               </w:rPr>
             </w:pPr>
-            <w:r>
-              <w:rPr>
-                <w:rFonts w:ascii="Times New Roman" w:hAnsi="Times New Roman" w:cs="Times New Roman"/>
-                <w:sz w:val="26"/>
-                <w:szCs w:val="26"/>
-              </w:rPr>
-            </w:r>
           </w:p>
         </w:tc>
         <w:tc>
@@ -8723,13 +7507,6 @@
                 <w:szCs w:val="26"/>
               </w:rPr>
             </w:pPr>
-            <w:r>
-              <w:rPr>
-                <w:rFonts w:ascii="Times New Roman" w:hAnsi="Times New Roman" w:cs="Times New Roman"/>
-                <w:sz w:val="26"/>
-                <w:szCs w:val="26"/>
-              </w:rPr>
-            </w:r>
           </w:p>
         </w:tc>
         <w:tc>
@@ -8751,13 +7528,6 @@
                 <w:szCs w:val="26"/>
               </w:rPr>
             </w:pPr>
-            <w:r>
-              <w:rPr>
-                <w:rFonts w:ascii="Times New Roman" w:hAnsi="Times New Roman" w:cs="Times New Roman"/>
-                <w:sz w:val="26"/>
-                <w:szCs w:val="26"/>
-              </w:rPr>
-            </w:r>
           </w:p>
         </w:tc>
         <w:tc>
@@ -8779,13 +7549,6 @@
                 <w:szCs w:val="26"/>
               </w:rPr>
             </w:pPr>
-            <w:r>
-              <w:rPr>
-                <w:rFonts w:ascii="Times New Roman" w:hAnsi="Times New Roman" w:cs="Times New Roman"/>
-                <w:sz w:val="26"/>
-                <w:szCs w:val="26"/>
-              </w:rPr>
-            </w:r>
           </w:p>
         </w:tc>
       </w:tr>
@@ -8865,13 +7628,6 @@
                 <w:szCs w:val="26"/>
               </w:rPr>
             </w:pPr>
-            <w:r>
-              <w:rPr>
-                <w:rFonts w:ascii="Times New Roman" w:hAnsi="Times New Roman" w:cs="Times New Roman"/>
-                <w:sz w:val="26"/>
-                <w:szCs w:val="26"/>
-              </w:rPr>
-            </w:r>
           </w:p>
         </w:tc>
         <w:tc>
@@ -8893,13 +7649,6 @@
                 <w:szCs w:val="26"/>
               </w:rPr>
             </w:pPr>
-            <w:r>
-              <w:rPr>
-                <w:rFonts w:ascii="Times New Roman" w:hAnsi="Times New Roman" w:cs="Times New Roman"/>
-                <w:sz w:val="26"/>
-                <w:szCs w:val="26"/>
-              </w:rPr>
-            </w:r>
           </w:p>
         </w:tc>
         <w:tc>
@@ -8921,13 +7670,6 @@
                 <w:szCs w:val="26"/>
               </w:rPr>
             </w:pPr>
-            <w:r>
-              <w:rPr>
-                <w:rFonts w:ascii="Times New Roman" w:hAnsi="Times New Roman" w:cs="Times New Roman"/>
-                <w:sz w:val="26"/>
-                <w:szCs w:val="26"/>
-              </w:rPr>
-            </w:r>
           </w:p>
         </w:tc>
         <w:tc>
@@ -8949,13 +7691,6 @@
                 <w:szCs w:val="26"/>
               </w:rPr>
             </w:pPr>
-            <w:r>
-              <w:rPr>
-                <w:rFonts w:ascii="Times New Roman" w:hAnsi="Times New Roman" w:cs="Times New Roman"/>
-                <w:sz w:val="26"/>
-                <w:szCs w:val="26"/>
-              </w:rPr>
-            </w:r>
           </w:p>
         </w:tc>
         <w:tc>
@@ -8977,13 +7712,6 @@
                 <w:szCs w:val="26"/>
               </w:rPr>
             </w:pPr>
-            <w:r>
-              <w:rPr>
-                <w:rFonts w:ascii="Times New Roman" w:hAnsi="Times New Roman" w:cs="Times New Roman"/>
-                <w:sz w:val="26"/>
-                <w:szCs w:val="26"/>
-              </w:rPr>
-            </w:r>
           </w:p>
         </w:tc>
       </w:tr>
@@ -9063,13 +7791,6 @@
                 <w:szCs w:val="26"/>
               </w:rPr>
             </w:pPr>
-            <w:r>
-              <w:rPr>
-                <w:rFonts w:ascii="Times New Roman" w:hAnsi="Times New Roman" w:cs="Times New Roman"/>
-                <w:sz w:val="26"/>
-                <w:szCs w:val="26"/>
-              </w:rPr>
-            </w:r>
           </w:p>
         </w:tc>
         <w:tc>
@@ -9091,13 +7812,6 @@
                 <w:szCs w:val="26"/>
               </w:rPr>
             </w:pPr>
-            <w:r>
-              <w:rPr>
-                <w:rFonts w:ascii="Times New Roman" w:hAnsi="Times New Roman" w:cs="Times New Roman"/>
-                <w:sz w:val="26"/>
-                <w:szCs w:val="26"/>
-              </w:rPr>
-            </w:r>
           </w:p>
         </w:tc>
         <w:tc>
@@ -9119,13 +7833,6 @@
                 <w:szCs w:val="26"/>
               </w:rPr>
             </w:pPr>
-            <w:r>
-              <w:rPr>
-                <w:rFonts w:ascii="Times New Roman" w:hAnsi="Times New Roman" w:cs="Times New Roman"/>
-                <w:sz w:val="26"/>
-                <w:szCs w:val="26"/>
-              </w:rPr>
-            </w:r>
           </w:p>
         </w:tc>
         <w:tc>
@@ -9147,13 +7854,6 @@
                 <w:szCs w:val="26"/>
               </w:rPr>
             </w:pPr>
-            <w:r>
-              <w:rPr>
-                <w:rFonts w:ascii="Times New Roman" w:hAnsi="Times New Roman" w:cs="Times New Roman"/>
-                <w:sz w:val="26"/>
-                <w:szCs w:val="26"/>
-              </w:rPr>
-            </w:r>
           </w:p>
         </w:tc>
         <w:tc>
@@ -9175,13 +7875,6 @@
                 <w:szCs w:val="26"/>
               </w:rPr>
             </w:pPr>
-            <w:r>
-              <w:rPr>
-                <w:rFonts w:ascii="Times New Roman" w:hAnsi="Times New Roman" w:cs="Times New Roman"/>
-                <w:sz w:val="26"/>
-                <w:szCs w:val="26"/>
-              </w:rPr>
-            </w:r>
           </w:p>
         </w:tc>
       </w:tr>
@@ -9261,13 +7954,6 @@
                 <w:szCs w:val="26"/>
               </w:rPr>
             </w:pPr>
-            <w:r>
-              <w:rPr>
-                <w:rFonts w:ascii="Times New Roman" w:hAnsi="Times New Roman" w:cs="Times New Roman"/>
-                <w:sz w:val="26"/>
-                <w:szCs w:val="26"/>
-              </w:rPr>
-            </w:r>
           </w:p>
         </w:tc>
         <w:tc>
@@ -9289,13 +7975,6 @@
                 <w:szCs w:val="26"/>
               </w:rPr>
             </w:pPr>
-            <w:r>
-              <w:rPr>
-                <w:rFonts w:ascii="Times New Roman" w:hAnsi="Times New Roman" w:cs="Times New Roman"/>
-                <w:sz w:val="26"/>
-                <w:szCs w:val="26"/>
-              </w:rPr>
-            </w:r>
           </w:p>
         </w:tc>
         <w:tc>
@@ -9317,13 +7996,6 @@
                 <w:szCs w:val="26"/>
               </w:rPr>
             </w:pPr>
-            <w:r>
-              <w:rPr>
-                <w:rFonts w:ascii="Times New Roman" w:hAnsi="Times New Roman" w:cs="Times New Roman"/>
-                <w:sz w:val="26"/>
-                <w:szCs w:val="26"/>
-              </w:rPr>
-            </w:r>
           </w:p>
         </w:tc>
         <w:tc>
@@ -9345,13 +8017,6 @@
                 <w:szCs w:val="26"/>
               </w:rPr>
             </w:pPr>
-            <w:r>
-              <w:rPr>
-                <w:rFonts w:ascii="Times New Roman" w:hAnsi="Times New Roman" w:cs="Times New Roman"/>
-                <w:sz w:val="26"/>
-                <w:szCs w:val="26"/>
-              </w:rPr>
-            </w:r>
           </w:p>
         </w:tc>
         <w:tc>
@@ -9373,13 +8038,6 @@
                 <w:szCs w:val="26"/>
               </w:rPr>
             </w:pPr>
-            <w:r>
-              <w:rPr>
-                <w:rFonts w:ascii="Times New Roman" w:hAnsi="Times New Roman" w:cs="Times New Roman"/>
-                <w:sz w:val="26"/>
-                <w:szCs w:val="26"/>
-              </w:rPr>
-            </w:r>
           </w:p>
         </w:tc>
       </w:tr>
@@ -9459,12 +8117,6 @@
                 <w:szCs w:val="26"/>
               </w:rPr>
             </w:pPr>
-            <w:r>
-              <w:rPr>
-                <w:rFonts w:ascii="Times New Roman" w:hAnsi="Times New Roman"/>
-                <w:sz w:val="26"/>
-              </w:rPr>
-            </w:r>
           </w:p>
         </w:tc>
         <w:tc>
@@ -9486,12 +8138,6 @@
                 <w:szCs w:val="26"/>
               </w:rPr>
             </w:pPr>
-            <w:r>
-              <w:rPr>
-                <w:rFonts w:ascii="Times New Roman" w:hAnsi="Times New Roman"/>
-                <w:sz w:val="26"/>
-              </w:rPr>
-            </w:r>
           </w:p>
         </w:tc>
         <w:tc>
@@ -9513,12 +8159,6 @@
                 <w:szCs w:val="26"/>
               </w:rPr>
             </w:pPr>
-            <w:r>
-              <w:rPr>
-                <w:rFonts w:ascii="Times New Roman" w:hAnsi="Times New Roman"/>
-                <w:sz w:val="26"/>
-              </w:rPr>
-            </w:r>
           </w:p>
         </w:tc>
         <w:tc>
@@ -9540,12 +8180,6 @@
                 <w:szCs w:val="26"/>
               </w:rPr>
             </w:pPr>
-            <w:r>
-              <w:rPr>
-                <w:rFonts w:ascii="Times New Roman" w:hAnsi="Times New Roman"/>
-                <w:sz w:val="26"/>
-              </w:rPr>
-            </w:r>
           </w:p>
         </w:tc>
         <w:tc>
@@ -9567,12 +8201,6 @@
                 <w:szCs w:val="26"/>
               </w:rPr>
             </w:pPr>
-            <w:r>
-              <w:rPr>
-                <w:rFonts w:ascii="Times New Roman" w:hAnsi="Times New Roman"/>
-                <w:sz w:val="26"/>
-              </w:rPr>
-            </w:r>
           </w:p>
         </w:tc>
       </w:tr>
@@ -9639,146 +8267,36 @@
         </w:tc>
         <w:tc>
           <w:tcPr>
-            <w:tcW w:w="709" w:type="dxa"/>
-            <w:tcBorders>
-              <w:top w:val="single" w:sz="4" w:space="0" w:color="000000"/>
-              <w:left w:val="single" w:sz="4" w:space="0" w:color="000000"/>
-              <w:bottom w:val="single" w:sz="4" w:space="0" w:color="000000"/>
-              <w:right w:val="single" w:sz="4" w:space="0" w:color="000000"/>
-            </w:tcBorders>
-            <w:vAlign w:val="center"/>
-          </w:tcPr>
-          <w:p>
-            <w:pPr>
-              <w:rPr>
-                <w:rFonts w:ascii="Times New Roman" w:hAnsi="Times New Roman" w:cs="Times New Roman"/>
-                <w:sz w:val="26"/>
-                <w:szCs w:val="26"/>
-              </w:rPr>
-            </w:pPr>
-            <w:r>
-              <w:rPr>
-                <w:rFonts w:ascii="Times New Roman" w:hAnsi="Times New Roman" w:cs="Times New Roman"/>
-                <w:sz w:val="26"/>
-                <w:szCs w:val="26"/>
-              </w:rPr>
-              <w:t>7</w:t>
-            </w:r>
-          </w:p>
-        </w:tc>
-        <w:tc>
-          <w:tcPr>
-            <w:tcW w:w="1276" w:type="dxa"/>
-            <w:tcBorders>
-              <w:top w:val="single" w:sz="4" w:space="0" w:color="000000"/>
-              <w:left w:val="single" w:sz="4" w:space="0" w:color="000000"/>
-              <w:bottom w:val="single" w:sz="4" w:space="0" w:color="000000"/>
-              <w:right w:val="single" w:sz="4" w:space="0" w:color="000000"/>
-            </w:tcBorders>
-            <w:vAlign w:val="center"/>
-          </w:tcPr>
-          <w:p>
-            <w:pPr>
-              <w:rPr>
-                <w:rFonts w:ascii="Times New Roman" w:hAnsi="Times New Roman" w:cs="Times New Roman"/>
-                <w:sz w:val="26"/>
-                <w:szCs w:val="26"/>
-              </w:rPr>
-            </w:pPr>
-            <w:r>
-              <w:rPr>
-                <w:rFonts w:ascii="Times New Roman" w:hAnsi="Times New Roman" w:cs="Times New Roman"/>
-                <w:sz w:val="26"/>
-                <w:szCs w:val="26"/>
-              </w:rPr>
-              <w:t>Tin - Robotics</w:t>
-            </w:r>
-          </w:p>
-        </w:tc>
-        <w:tc>
-          <w:tcPr>
-            <w:tcW w:w="992" w:type="dxa"/>
-            <w:tcBorders>
-              <w:top w:val="single" w:sz="4" w:space="0" w:color="000000"/>
-              <w:left w:val="single" w:sz="4" w:space="0" w:color="000000"/>
-              <w:bottom w:val="single" w:sz="4" w:space="0" w:color="000000"/>
-              <w:right w:val="single" w:sz="4" w:space="0" w:color="000000"/>
-            </w:tcBorders>
-            <w:vAlign w:val="center"/>
-          </w:tcPr>
-          <w:p>
-            <w:pPr>
-              <w:rPr>
-                <w:rFonts w:ascii="Times New Roman" w:hAnsi="Times New Roman" w:cs="Times New Roman"/>
-                <w:sz w:val="26"/>
-                <w:szCs w:val="26"/>
-              </w:rPr>
-            </w:pPr>
-            <w:r>
-              <w:rPr>
-                <w:rFonts w:ascii="Times New Roman" w:hAnsi="Times New Roman" w:cs="Times New Roman"/>
-                <w:sz w:val="26"/>
-                <w:szCs w:val="26"/>
-              </w:rPr>
-              <w:t>8A1</w:t>
-            </w:r>
-          </w:p>
-        </w:tc>
-        <w:tc>
-          <w:tcPr>
-            <w:tcW w:w="3260" w:type="dxa"/>
-            <w:tcBorders>
-              <w:top w:val="single" w:sz="4" w:space="0" w:color="000000"/>
-              <w:left w:val="single" w:sz="4" w:space="0" w:color="000000"/>
-              <w:bottom w:val="single" w:sz="4" w:space="0" w:color="000000"/>
-              <w:right w:val="single" w:sz="4" w:space="0" w:color="000000"/>
-            </w:tcBorders>
-            <w:vAlign w:val="center"/>
-          </w:tcPr>
-          <w:p>
-            <w:pPr>
-              <w:rPr>
-                <w:rFonts w:ascii="Times New Roman" w:hAnsi="Times New Roman" w:cs="Times New Roman"/>
-                <w:sz w:val="26"/>
-                <w:szCs w:val="26"/>
-              </w:rPr>
-            </w:pPr>
-            <w:r>
-              <w:rPr>
-                <w:rFonts w:ascii="Times New Roman" w:hAnsi="Times New Roman" w:cs="Times New Roman"/>
-                <w:sz w:val="26"/>
-                <w:szCs w:val="26"/>
-              </w:rPr>
-              <w:t>Bài 4. Đạo đức và văn hóa trong sử dụng công nghệ số</w:t>
-            </w:r>
-          </w:p>
-        </w:tc>
-        <w:tc>
-          <w:tcPr>
-            <w:tcW w:w="1967" w:type="dxa"/>
-            <w:tcBorders>
-              <w:top w:val="single" w:sz="4" w:space="0" w:color="000000"/>
-              <w:left w:val="single" w:sz="4" w:space="0" w:color="000000"/>
-              <w:bottom w:val="single" w:sz="4" w:space="0" w:color="000000"/>
-              <w:right w:val="single" w:sz="4" w:space="0" w:color="000000"/>
-            </w:tcBorders>
-            <w:vAlign w:val="center"/>
-          </w:tcPr>
-          <w:p>
-            <w:pPr>
-              <w:rPr>
-                <w:rFonts w:ascii="Times New Roman" w:hAnsi="Times New Roman" w:cs="Times New Roman"/>
-                <w:sz w:val="26"/>
-                <w:szCs w:val="26"/>
-              </w:rPr>
-            </w:pPr>
-            <w:r>
-              <w:rPr>
-                <w:rFonts w:ascii="Times New Roman" w:hAnsi="Times New Roman" w:cs="Times New Roman"/>
-                <w:sz w:val="26"/>
-                <w:szCs w:val="26"/>
-              </w:rPr>
-              <w:t>Phòng Tin học</w:t>
+            <w:tcW w:w="8204" w:type="dxa"/>
+            <w:gridSpan w:val="5"/>
+            <w:vMerge w:val="restart"/>
+            <w:tcBorders>
+              <w:top w:val="single" w:sz="4" w:space="0" w:color="000000"/>
+              <w:left w:val="single" w:sz="4" w:space="0" w:color="000000"/>
+              <w:right w:val="single" w:sz="4" w:space="0" w:color="000000"/>
+            </w:tcBorders>
+            <w:vAlign w:val="center"/>
+          </w:tcPr>
+          <w:p>
+            <w:pPr>
+              <w:jc w:val="center"/>
+              <w:rPr>
+                <w:rFonts w:ascii="Times New Roman" w:hAnsi="Times New Roman" w:cs="Times New Roman"/>
+                <w:b/>
+                <w:bCs/>
+                <w:sz w:val="26"/>
+                <w:szCs w:val="26"/>
+              </w:rPr>
+            </w:pPr>
+            <w:r>
+              <w:rPr>
+                <w:rFonts w:ascii="Times New Roman" w:hAnsi="Times New Roman" w:cs="Times New Roman"/>
+                <w:b/>
+                <w:bCs/>
+                <w:sz w:val="26"/>
+                <w:szCs w:val="26"/>
+              </w:rPr>
+              <w:t>Trung thu</w:t>
             </w:r>
           </w:p>
         </w:tc>
@@ -9839,147 +8357,23 @@
         </w:tc>
         <w:tc>
           <w:tcPr>
-            <w:tcW w:w="709" w:type="dxa"/>
-            <w:tcBorders>
-              <w:top w:val="single" w:sz="4" w:space="0" w:color="000000"/>
-              <w:left w:val="single" w:sz="4" w:space="0" w:color="000000"/>
-              <w:bottom w:val="single" w:sz="4" w:space="0" w:color="000000"/>
-              <w:right w:val="single" w:sz="4" w:space="0" w:color="000000"/>
-            </w:tcBorders>
-            <w:vAlign w:val="center"/>
-          </w:tcPr>
-          <w:p>
-            <w:pPr>
-              <w:rPr>
-                <w:rFonts w:ascii="Times New Roman" w:hAnsi="Times New Roman" w:cs="Times New Roman"/>
-                <w:sz w:val="26"/>
-                <w:szCs w:val="26"/>
-              </w:rPr>
-            </w:pPr>
-            <w:r>
-              <w:rPr>
-                <w:rFonts w:ascii="Times New Roman" w:hAnsi="Times New Roman" w:cs="Times New Roman"/>
-                <w:sz w:val="26"/>
-                <w:szCs w:val="26"/>
-              </w:rPr>
-              <w:t>8</w:t>
-            </w:r>
-          </w:p>
-        </w:tc>
-        <w:tc>
-          <w:tcPr>
-            <w:tcW w:w="1276" w:type="dxa"/>
-            <w:tcBorders>
-              <w:top w:val="single" w:sz="4" w:space="0" w:color="000000"/>
-              <w:left w:val="single" w:sz="4" w:space="0" w:color="000000"/>
-              <w:bottom w:val="single" w:sz="4" w:space="0" w:color="000000"/>
-              <w:right w:val="single" w:sz="4" w:space="0" w:color="000000"/>
-            </w:tcBorders>
-            <w:vAlign w:val="center"/>
-          </w:tcPr>
-          <w:p>
-            <w:pPr>
-              <w:rPr>
-                <w:rFonts w:ascii="Times New Roman" w:hAnsi="Times New Roman" w:cs="Times New Roman"/>
-                <w:sz w:val="26"/>
-                <w:szCs w:val="26"/>
-              </w:rPr>
-            </w:pPr>
-            <w:r>
-              <w:rPr>
-                <w:rFonts w:ascii="Times New Roman" w:hAnsi="Times New Roman" w:cs="Times New Roman"/>
-                <w:sz w:val="26"/>
-                <w:szCs w:val="26"/>
-              </w:rPr>
-              <w:t>Tin - Robotics</w:t>
-            </w:r>
-          </w:p>
-        </w:tc>
-        <w:tc>
-          <w:tcPr>
-            <w:tcW w:w="992" w:type="dxa"/>
-            <w:tcBorders>
-              <w:top w:val="single" w:sz="4" w:space="0" w:color="000000"/>
-              <w:left w:val="single" w:sz="4" w:space="0" w:color="000000"/>
-              <w:bottom w:val="single" w:sz="4" w:space="0" w:color="000000"/>
-              <w:right w:val="single" w:sz="4" w:space="0" w:color="000000"/>
-            </w:tcBorders>
-            <w:vAlign w:val="center"/>
-          </w:tcPr>
-          <w:p>
-            <w:pPr>
-              <w:rPr>
-                <w:rFonts w:ascii="Times New Roman" w:hAnsi="Times New Roman" w:cs="Times New Roman"/>
-                <w:sz w:val="26"/>
-                <w:szCs w:val="26"/>
-              </w:rPr>
-            </w:pPr>
-            <w:r>
-              <w:rPr>
-                <w:rFonts w:ascii="Times New Roman" w:hAnsi="Times New Roman" w:cs="Times New Roman"/>
-                <w:sz w:val="26"/>
-                <w:szCs w:val="26"/>
-              </w:rPr>
-              <w:t>8A1</w:t>
-            </w:r>
-          </w:p>
-        </w:tc>
-        <w:tc>
-          <w:tcPr>
-            <w:tcW w:w="3260" w:type="dxa"/>
-            <w:tcBorders>
-              <w:top w:val="single" w:sz="4" w:space="0" w:color="000000"/>
-              <w:left w:val="single" w:sz="4" w:space="0" w:color="000000"/>
-              <w:bottom w:val="single" w:sz="4" w:space="0" w:color="000000"/>
-              <w:right w:val="single" w:sz="4" w:space="0" w:color="000000"/>
-            </w:tcBorders>
-            <w:vAlign w:val="center"/>
-          </w:tcPr>
-          <w:p>
-            <w:pPr>
-              <w:rPr>
-                <w:rFonts w:ascii="Times New Roman" w:hAnsi="Times New Roman" w:cs="Times New Roman"/>
-                <w:sz w:val="26"/>
-                <w:szCs w:val="26"/>
-              </w:rPr>
-            </w:pPr>
-            <w:r>
-              <w:rPr>
-                <w:rFonts w:ascii="Times New Roman" w:hAnsi="Times New Roman" w:cs="Times New Roman"/>
-                <w:sz w:val="26"/>
-                <w:szCs w:val="26"/>
-              </w:rPr>
-              <w:t>Bài 5. Sử dụng bảng tính giải quyết bài toán thực tế (Tiết 1)</w:t>
-            </w:r>
-          </w:p>
-        </w:tc>
-        <w:tc>
-          <w:tcPr>
-            <w:tcW w:w="1967" w:type="dxa"/>
-            <w:tcBorders>
-              <w:top w:val="single" w:sz="4" w:space="0" w:color="000000"/>
-              <w:left w:val="single" w:sz="4" w:space="0" w:color="000000"/>
-              <w:bottom w:val="single" w:sz="4" w:space="0" w:color="000000"/>
-              <w:right w:val="single" w:sz="4" w:space="0" w:color="000000"/>
-            </w:tcBorders>
-            <w:vAlign w:val="center"/>
-          </w:tcPr>
-          <w:p>
-            <w:pPr>
-              <w:rPr>
-                <w:rFonts w:ascii="Times New Roman" w:hAnsi="Times New Roman" w:cs="Times New Roman"/>
-                <w:sz w:val="26"/>
-                <w:szCs w:val="26"/>
-              </w:rPr>
-            </w:pPr>
-            <w:r>
-              <w:rPr>
-                <w:rFonts w:ascii="Times New Roman" w:hAnsi="Times New Roman" w:cs="Times New Roman"/>
-                <w:sz w:val="26"/>
-                <w:szCs w:val="26"/>
-              </w:rPr>
-              <w:t>Phòng Tin học</w:t>
-            </w:r>
+            <w:tcW w:w="8204" w:type="dxa"/>
+            <w:gridSpan w:val="5"/>
+            <w:vMerge/>
+            <w:tcBorders>
+              <w:left w:val="single" w:sz="4" w:space="0" w:color="000000"/>
+              <w:right w:val="single" w:sz="4" w:space="0" w:color="000000"/>
+            </w:tcBorders>
+            <w:vAlign w:val="center"/>
+          </w:tcPr>
+          <w:p>
+            <w:pPr>
+              <w:rPr>
+                <w:rFonts w:ascii="Times New Roman" w:hAnsi="Times New Roman" w:cs="Times New Roman"/>
+                <w:sz w:val="26"/>
+                <w:szCs w:val="26"/>
+              </w:rPr>
+            </w:pPr>
           </w:p>
         </w:tc>
       </w:tr>
@@ -10039,142 +8433,23 @@
         </w:tc>
         <w:tc>
           <w:tcPr>
-            <w:tcW w:w="709" w:type="dxa"/>
-            <w:tcBorders>
-              <w:top w:val="single" w:sz="4" w:space="0" w:color="000000"/>
-              <w:left w:val="single" w:sz="4" w:space="0" w:color="000000"/>
-              <w:bottom w:val="single" w:sz="4" w:space="0" w:color="000000"/>
-              <w:right w:val="single" w:sz="4" w:space="0" w:color="000000"/>
-            </w:tcBorders>
-            <w:vAlign w:val="center"/>
-          </w:tcPr>
-          <w:p>
-            <w:pPr>
-              <w:rPr>
-                <w:rFonts w:ascii="Times New Roman" w:hAnsi="Times New Roman" w:cs="Times New Roman"/>
-                <w:sz w:val="26"/>
-                <w:szCs w:val="26"/>
-              </w:rPr>
-            </w:pPr>
-            <w:r>
-              <w:rPr>
-                <w:rFonts w:ascii="Times New Roman" w:hAnsi="Times New Roman" w:cs="Times New Roman"/>
-                <w:sz w:val="26"/>
-                <w:szCs w:val="26"/>
-              </w:rPr>
-            </w:r>
-          </w:p>
-        </w:tc>
-        <w:tc>
-          <w:tcPr>
-            <w:tcW w:w="1276" w:type="dxa"/>
-            <w:tcBorders>
-              <w:top w:val="single" w:sz="4" w:space="0" w:color="000000"/>
-              <w:left w:val="single" w:sz="4" w:space="0" w:color="000000"/>
-              <w:bottom w:val="single" w:sz="4" w:space="0" w:color="000000"/>
-              <w:right w:val="single" w:sz="4" w:space="0" w:color="000000"/>
-            </w:tcBorders>
-            <w:vAlign w:val="center"/>
-          </w:tcPr>
-          <w:p>
-            <w:pPr>
-              <w:rPr>
-                <w:rFonts w:ascii="Times New Roman" w:hAnsi="Times New Roman" w:cs="Times New Roman"/>
-                <w:sz w:val="26"/>
-                <w:szCs w:val="26"/>
-              </w:rPr>
-            </w:pPr>
-            <w:r>
-              <w:rPr>
-                <w:rFonts w:ascii="Times New Roman" w:hAnsi="Times New Roman" w:cs="Times New Roman"/>
-                <w:sz w:val="26"/>
-                <w:szCs w:val="26"/>
-              </w:rPr>
-            </w:r>
-          </w:p>
-        </w:tc>
-        <w:tc>
-          <w:tcPr>
-            <w:tcW w:w="992" w:type="dxa"/>
-            <w:tcBorders>
-              <w:top w:val="single" w:sz="4" w:space="0" w:color="000000"/>
-              <w:left w:val="single" w:sz="4" w:space="0" w:color="000000"/>
-              <w:bottom w:val="single" w:sz="4" w:space="0" w:color="000000"/>
-              <w:right w:val="single" w:sz="4" w:space="0" w:color="000000"/>
-            </w:tcBorders>
-            <w:vAlign w:val="center"/>
-          </w:tcPr>
-          <w:p>
-            <w:pPr>
-              <w:rPr>
-                <w:rFonts w:ascii="Times New Roman" w:hAnsi="Times New Roman" w:cs="Times New Roman"/>
-                <w:sz w:val="26"/>
-                <w:szCs w:val="26"/>
-              </w:rPr>
-            </w:pPr>
-            <w:r>
-              <w:rPr>
-                <w:rFonts w:ascii="Times New Roman" w:hAnsi="Times New Roman" w:cs="Times New Roman"/>
-                <w:sz w:val="26"/>
-                <w:szCs w:val="26"/>
-              </w:rPr>
-            </w:r>
-          </w:p>
-        </w:tc>
-        <w:tc>
-          <w:tcPr>
-            <w:tcW w:w="3260" w:type="dxa"/>
-            <w:tcBorders>
-              <w:top w:val="single" w:sz="4" w:space="0" w:color="000000"/>
-              <w:left w:val="single" w:sz="4" w:space="0" w:color="000000"/>
-              <w:bottom w:val="single" w:sz="4" w:space="0" w:color="000000"/>
-              <w:right w:val="single" w:sz="4" w:space="0" w:color="000000"/>
-            </w:tcBorders>
-            <w:vAlign w:val="center"/>
-          </w:tcPr>
-          <w:p>
-            <w:pPr>
-              <w:rPr>
-                <w:rFonts w:ascii="Times New Roman" w:hAnsi="Times New Roman" w:cs="Times New Roman"/>
-                <w:sz w:val="26"/>
-                <w:szCs w:val="26"/>
-              </w:rPr>
-            </w:pPr>
-            <w:r>
-              <w:rPr>
-                <w:rFonts w:ascii="Times New Roman" w:hAnsi="Times New Roman" w:cs="Times New Roman"/>
-                <w:sz w:val="26"/>
-                <w:szCs w:val="26"/>
-              </w:rPr>
-            </w:r>
-          </w:p>
-        </w:tc>
-        <w:tc>
-          <w:tcPr>
-            <w:tcW w:w="1967" w:type="dxa"/>
-            <w:tcBorders>
-              <w:top w:val="single" w:sz="4" w:space="0" w:color="000000"/>
-              <w:left w:val="single" w:sz="4" w:space="0" w:color="000000"/>
-              <w:bottom w:val="single" w:sz="4" w:space="0" w:color="000000"/>
-              <w:right w:val="single" w:sz="4" w:space="0" w:color="000000"/>
-            </w:tcBorders>
-            <w:vAlign w:val="center"/>
-          </w:tcPr>
-          <w:p>
-            <w:pPr>
-              <w:rPr>
-                <w:rFonts w:ascii="Times New Roman" w:hAnsi="Times New Roman" w:cs="Times New Roman"/>
-                <w:sz w:val="26"/>
-                <w:szCs w:val="26"/>
-              </w:rPr>
-            </w:pPr>
-            <w:r>
-              <w:rPr>
-                <w:rFonts w:ascii="Times New Roman" w:hAnsi="Times New Roman" w:cs="Times New Roman"/>
-                <w:sz w:val="26"/>
-                <w:szCs w:val="26"/>
-              </w:rPr>
-            </w:r>
+            <w:tcW w:w="8204" w:type="dxa"/>
+            <w:gridSpan w:val="5"/>
+            <w:vMerge/>
+            <w:tcBorders>
+              <w:left w:val="single" w:sz="4" w:space="0" w:color="000000"/>
+              <w:right w:val="single" w:sz="4" w:space="0" w:color="000000"/>
+            </w:tcBorders>
+            <w:vAlign w:val="center"/>
+          </w:tcPr>
+          <w:p>
+            <w:pPr>
+              <w:rPr>
+                <w:rFonts w:ascii="Times New Roman" w:hAnsi="Times New Roman" w:cs="Times New Roman"/>
+                <w:sz w:val="26"/>
+                <w:szCs w:val="26"/>
+              </w:rPr>
+            </w:pPr>
           </w:p>
         </w:tc>
       </w:tr>
@@ -10234,137 +8509,23 @@
         </w:tc>
         <w:tc>
           <w:tcPr>
-            <w:tcW w:w="709" w:type="dxa"/>
-            <w:tcBorders>
-              <w:top w:val="single" w:sz="4" w:space="0" w:color="000000"/>
-              <w:left w:val="single" w:sz="4" w:space="0" w:color="000000"/>
-              <w:bottom w:val="single" w:sz="4" w:space="0" w:color="000000"/>
-              <w:right w:val="single" w:sz="4" w:space="0" w:color="000000"/>
-            </w:tcBorders>
-            <w:vAlign w:val="center"/>
-          </w:tcPr>
-          <w:p>
-            <w:pPr>
-              <w:rPr>
-                <w:rFonts w:ascii="Times New Roman" w:hAnsi="Times New Roman" w:cs="Times New Roman"/>
-                <w:sz w:val="26"/>
-                <w:szCs w:val="26"/>
-              </w:rPr>
-            </w:pPr>
-            <w:r>
-              <w:rPr>
-                <w:rFonts w:ascii="Times New Roman" w:hAnsi="Times New Roman"/>
-                <w:sz w:val="26"/>
-              </w:rPr>
-            </w:r>
-          </w:p>
-        </w:tc>
-        <w:tc>
-          <w:tcPr>
-            <w:tcW w:w="1276" w:type="dxa"/>
-            <w:tcBorders>
-              <w:top w:val="single" w:sz="4" w:space="0" w:color="000000"/>
-              <w:left w:val="single" w:sz="4" w:space="0" w:color="000000"/>
-              <w:bottom w:val="single" w:sz="4" w:space="0" w:color="000000"/>
-              <w:right w:val="single" w:sz="4" w:space="0" w:color="000000"/>
-            </w:tcBorders>
-            <w:vAlign w:val="center"/>
-          </w:tcPr>
-          <w:p>
-            <w:pPr>
-              <w:rPr>
-                <w:rFonts w:ascii="Times New Roman" w:hAnsi="Times New Roman" w:cs="Times New Roman"/>
-                <w:sz w:val="26"/>
-                <w:szCs w:val="26"/>
-              </w:rPr>
-            </w:pPr>
-            <w:r>
-              <w:rPr>
-                <w:rFonts w:ascii="Times New Roman" w:hAnsi="Times New Roman"/>
-                <w:sz w:val="26"/>
-              </w:rPr>
-            </w:r>
-          </w:p>
-        </w:tc>
-        <w:tc>
-          <w:tcPr>
-            <w:tcW w:w="992" w:type="dxa"/>
-            <w:tcBorders>
-              <w:top w:val="single" w:sz="4" w:space="0" w:color="000000"/>
-              <w:left w:val="single" w:sz="4" w:space="0" w:color="000000"/>
-              <w:bottom w:val="single" w:sz="4" w:space="0" w:color="000000"/>
-              <w:right w:val="single" w:sz="4" w:space="0" w:color="000000"/>
-            </w:tcBorders>
-            <w:vAlign w:val="center"/>
-          </w:tcPr>
-          <w:p>
-            <w:pPr>
-              <w:rPr>
-                <w:rFonts w:ascii="Times New Roman" w:hAnsi="Times New Roman" w:cs="Times New Roman"/>
-                <w:sz w:val="26"/>
-                <w:szCs w:val="26"/>
-              </w:rPr>
-            </w:pPr>
-            <w:r>
-              <w:rPr>
-                <w:rFonts w:ascii="Times New Roman" w:hAnsi="Times New Roman"/>
-                <w:sz w:val="26"/>
-              </w:rPr>
-            </w:r>
-          </w:p>
-        </w:tc>
-        <w:tc>
-          <w:tcPr>
-            <w:tcW w:w="3260" w:type="dxa"/>
-            <w:tcBorders>
-              <w:top w:val="single" w:sz="4" w:space="0" w:color="000000"/>
-              <w:left w:val="single" w:sz="4" w:space="0" w:color="000000"/>
-              <w:bottom w:val="single" w:sz="4" w:space="0" w:color="000000"/>
-              <w:right w:val="single" w:sz="4" w:space="0" w:color="000000"/>
-            </w:tcBorders>
-            <w:vAlign w:val="center"/>
-          </w:tcPr>
-          <w:p>
-            <w:pPr>
-              <w:rPr>
-                <w:rFonts w:ascii="Times New Roman" w:hAnsi="Times New Roman" w:cs="Times New Roman"/>
-                <w:sz w:val="26"/>
-                <w:szCs w:val="26"/>
-              </w:rPr>
-            </w:pPr>
-            <w:r>
-              <w:rPr>
-                <w:rFonts w:ascii="Times New Roman" w:hAnsi="Times New Roman"/>
-                <w:sz w:val="26"/>
-              </w:rPr>
-            </w:r>
-          </w:p>
-        </w:tc>
-        <w:tc>
-          <w:tcPr>
-            <w:tcW w:w="1967" w:type="dxa"/>
-            <w:tcBorders>
-              <w:top w:val="single" w:sz="4" w:space="0" w:color="000000"/>
-              <w:left w:val="single" w:sz="4" w:space="0" w:color="000000"/>
-              <w:bottom w:val="single" w:sz="4" w:space="0" w:color="000000"/>
-              <w:right w:val="single" w:sz="4" w:space="0" w:color="000000"/>
-            </w:tcBorders>
-            <w:vAlign w:val="center"/>
-          </w:tcPr>
-          <w:p>
-            <w:pPr>
-              <w:rPr>
-                <w:rFonts w:ascii="Times New Roman" w:hAnsi="Times New Roman" w:cs="Times New Roman"/>
-                <w:sz w:val="26"/>
-                <w:szCs w:val="26"/>
-              </w:rPr>
-            </w:pPr>
-            <w:r>
-              <w:rPr>
-                <w:rFonts w:ascii="Times New Roman" w:hAnsi="Times New Roman"/>
-                <w:sz w:val="26"/>
-              </w:rPr>
-            </w:r>
+            <w:tcW w:w="8204" w:type="dxa"/>
+            <w:gridSpan w:val="5"/>
+            <w:vMerge/>
+            <w:tcBorders>
+              <w:left w:val="single" w:sz="4" w:space="0" w:color="000000"/>
+              <w:right w:val="single" w:sz="4" w:space="0" w:color="000000"/>
+            </w:tcBorders>
+            <w:vAlign w:val="center"/>
+          </w:tcPr>
+          <w:p>
+            <w:pPr>
+              <w:rPr>
+                <w:rFonts w:ascii="Times New Roman" w:hAnsi="Times New Roman" w:cs="Times New Roman"/>
+                <w:sz w:val="26"/>
+                <w:szCs w:val="26"/>
+              </w:rPr>
+            </w:pPr>
           </w:p>
         </w:tc>
       </w:tr>
@@ -10424,137 +8585,24 @@
         </w:tc>
         <w:tc>
           <w:tcPr>
-            <w:tcW w:w="709" w:type="dxa"/>
-            <w:tcBorders>
-              <w:top w:val="single" w:sz="4" w:space="0" w:color="000000"/>
-              <w:left w:val="single" w:sz="4" w:space="0" w:color="000000"/>
-              <w:bottom w:val="single" w:sz="4" w:space="0" w:color="000000"/>
-              <w:right w:val="single" w:sz="4" w:space="0" w:color="000000"/>
-            </w:tcBorders>
-            <w:vAlign w:val="center"/>
-          </w:tcPr>
-          <w:p>
-            <w:pPr>
-              <w:rPr>
-                <w:rFonts w:ascii="Times New Roman" w:hAnsi="Times New Roman" w:cs="Times New Roman"/>
-                <w:sz w:val="26"/>
-                <w:szCs w:val="26"/>
-              </w:rPr>
-            </w:pPr>
-            <w:r>
-              <w:rPr>
-                <w:rFonts w:ascii="Times New Roman" w:hAnsi="Times New Roman"/>
-                <w:sz w:val="26"/>
-              </w:rPr>
-            </w:r>
-          </w:p>
-        </w:tc>
-        <w:tc>
-          <w:tcPr>
-            <w:tcW w:w="1276" w:type="dxa"/>
-            <w:tcBorders>
-              <w:top w:val="single" w:sz="4" w:space="0" w:color="000000"/>
-              <w:left w:val="single" w:sz="4" w:space="0" w:color="000000"/>
-              <w:bottom w:val="single" w:sz="4" w:space="0" w:color="000000"/>
-              <w:right w:val="single" w:sz="4" w:space="0" w:color="000000"/>
-            </w:tcBorders>
-            <w:vAlign w:val="center"/>
-          </w:tcPr>
-          <w:p>
-            <w:pPr>
-              <w:rPr>
-                <w:rFonts w:ascii="Times New Roman" w:hAnsi="Times New Roman" w:cs="Times New Roman"/>
-                <w:sz w:val="26"/>
-                <w:szCs w:val="26"/>
-              </w:rPr>
-            </w:pPr>
-            <w:r>
-              <w:rPr>
-                <w:rFonts w:ascii="Times New Roman" w:hAnsi="Times New Roman"/>
-                <w:sz w:val="26"/>
-              </w:rPr>
-            </w:r>
-          </w:p>
-        </w:tc>
-        <w:tc>
-          <w:tcPr>
-            <w:tcW w:w="992" w:type="dxa"/>
-            <w:tcBorders>
-              <w:top w:val="single" w:sz="4" w:space="0" w:color="000000"/>
-              <w:left w:val="single" w:sz="4" w:space="0" w:color="000000"/>
-              <w:bottom w:val="single" w:sz="4" w:space="0" w:color="000000"/>
-              <w:right w:val="single" w:sz="4" w:space="0" w:color="000000"/>
-            </w:tcBorders>
-            <w:vAlign w:val="center"/>
-          </w:tcPr>
-          <w:p>
-            <w:pPr>
-              <w:rPr>
-                <w:rFonts w:ascii="Times New Roman" w:hAnsi="Times New Roman" w:cs="Times New Roman"/>
-                <w:sz w:val="26"/>
-                <w:szCs w:val="26"/>
-              </w:rPr>
-            </w:pPr>
-            <w:r>
-              <w:rPr>
-                <w:rFonts w:ascii="Times New Roman" w:hAnsi="Times New Roman"/>
-                <w:sz w:val="26"/>
-              </w:rPr>
-            </w:r>
-          </w:p>
-        </w:tc>
-        <w:tc>
-          <w:tcPr>
-            <w:tcW w:w="3260" w:type="dxa"/>
-            <w:tcBorders>
-              <w:top w:val="single" w:sz="4" w:space="0" w:color="000000"/>
-              <w:left w:val="single" w:sz="4" w:space="0" w:color="000000"/>
-              <w:bottom w:val="single" w:sz="4" w:space="0" w:color="000000"/>
-              <w:right w:val="single" w:sz="4" w:space="0" w:color="000000"/>
-            </w:tcBorders>
-            <w:vAlign w:val="center"/>
-          </w:tcPr>
-          <w:p>
-            <w:pPr>
-              <w:rPr>
-                <w:rFonts w:ascii="Times New Roman" w:hAnsi="Times New Roman" w:cs="Times New Roman"/>
-                <w:sz w:val="26"/>
-                <w:szCs w:val="26"/>
-              </w:rPr>
-            </w:pPr>
-            <w:r>
-              <w:rPr>
-                <w:rFonts w:ascii="Times New Roman" w:hAnsi="Times New Roman"/>
-                <w:sz w:val="26"/>
-              </w:rPr>
-            </w:r>
-          </w:p>
-        </w:tc>
-        <w:tc>
-          <w:tcPr>
-            <w:tcW w:w="1967" w:type="dxa"/>
-            <w:tcBorders>
-              <w:top w:val="single" w:sz="4" w:space="0" w:color="000000"/>
-              <w:left w:val="single" w:sz="4" w:space="0" w:color="000000"/>
-              <w:bottom w:val="single" w:sz="4" w:space="0" w:color="000000"/>
-              <w:right w:val="single" w:sz="4" w:space="0" w:color="000000"/>
-            </w:tcBorders>
-            <w:vAlign w:val="center"/>
-          </w:tcPr>
-          <w:p>
-            <w:pPr>
-              <w:rPr>
-                <w:rFonts w:ascii="Times New Roman" w:hAnsi="Times New Roman" w:cs="Times New Roman"/>
-                <w:sz w:val="26"/>
-                <w:szCs w:val="26"/>
-              </w:rPr>
-            </w:pPr>
-            <w:r>
-              <w:rPr>
-                <w:rFonts w:ascii="Times New Roman" w:hAnsi="Times New Roman"/>
-                <w:sz w:val="26"/>
-              </w:rPr>
-            </w:r>
+            <w:tcW w:w="8204" w:type="dxa"/>
+            <w:gridSpan w:val="5"/>
+            <w:vMerge/>
+            <w:tcBorders>
+              <w:left w:val="single" w:sz="4" w:space="0" w:color="000000"/>
+              <w:bottom w:val="single" w:sz="4" w:space="0" w:color="000000"/>
+              <w:right w:val="single" w:sz="4" w:space="0" w:color="000000"/>
+            </w:tcBorders>
+            <w:vAlign w:val="center"/>
+          </w:tcPr>
+          <w:p>
+            <w:pPr>
+              <w:rPr>
+                <w:rFonts w:ascii="Times New Roman" w:hAnsi="Times New Roman" w:cs="Times New Roman"/>
+                <w:sz w:val="26"/>
+                <w:szCs w:val="26"/>
+              </w:rPr>
+            </w:pPr>
           </w:p>
         </w:tc>
       </w:tr>
@@ -10649,27 +8697,6 @@
               <w:br/>
               <w:t>…………………………………………………………………</w:t>
             </w:r>
-            <w:r>
-              <w:rPr>
-                <w:rFonts w:ascii="Times New Roman" w:hAnsi="Times New Roman" w:cs="Times New Roman"/>
-                <w:sz w:val="26"/>
-                <w:szCs w:val="26"/>
-              </w:rPr>
-            </w:r>
-            <w:r>
-              <w:rPr>
-                <w:rFonts w:ascii="Times New Roman" w:hAnsi="Times New Roman" w:cs="Times New Roman"/>
-                <w:sz w:val="26"/>
-                <w:szCs w:val="26"/>
-              </w:rPr>
-            </w:r>
-            <w:r>
-              <w:rPr>
-                <w:rFonts w:ascii="Times New Roman" w:hAnsi="Times New Roman" w:cs="Times New Roman"/>
-                <w:sz w:val="26"/>
-                <w:szCs w:val="26"/>
-              </w:rPr>
-            </w:r>
           </w:p>
         </w:tc>
         <w:tc>
@@ -10691,30 +8718,49 @@
                 <w:sz w:val="26"/>
               </w:rPr>
               <w:t>Ngày 18 tháng 9 năm 2026</w:t>
+            </w:r>
+            <w:r>
+              <w:rPr>
+                <w:rFonts w:ascii="Times New Roman" w:hAnsi="Times New Roman"/>
+                <w:sz w:val="26"/>
+              </w:rPr>
               <w:br/>
+              <w:t>Tổ trưởng</w:t>
             </w:r>
             <w:r>
               <w:rPr>
                 <w:rFonts w:ascii="Times New Roman" w:hAnsi="Times New Roman"/>
                 <w:sz w:val="26"/>
               </w:rPr>
-              <w:t>Tổ trưởng</w:t>
               <w:br/>
+            </w:r>
+            <w:r>
+              <w:rPr>
+                <w:rFonts w:ascii="Times New Roman" w:hAnsi="Times New Roman"/>
+                <w:sz w:val="26"/>
+              </w:rPr>
               <w:br/>
+            </w:r>
+            <w:r>
+              <w:rPr>
+                <w:rFonts w:ascii="Times New Roman" w:hAnsi="Times New Roman"/>
+                <w:sz w:val="26"/>
+              </w:rPr>
               <w:br/>
+            </w:r>
+            <w:r>
+              <w:rPr>
+                <w:rFonts w:ascii="Times New Roman" w:hAnsi="Times New Roman"/>
+                <w:sz w:val="26"/>
+              </w:rPr>
               <w:br/>
-            </w:r>
-            <w:r>
-              <w:rPr>
-                <w:rFonts w:ascii="Times New Roman" w:hAnsi="Times New Roman"/>
-                <w:sz w:val="26"/>
-              </w:rPr>
               <w:t>Nguyễn Thị Ngọc Ánh</w:t>
             </w:r>
           </w:p>
         </w:tc>
       </w:tr>
     </w:tbl>
+    <w:p/>
     <w:sectPr>
       <w:headerReference w:type="default" r:id="rId7"/>
       <w:footerReference w:type="default" r:id="rId8"/>
@@ -10729,7 +8775,7 @@
 </file>
 
 <file path=word/endnotes.xml><?xml version="1.0" encoding="utf-8"?>
-<w:endnotes xmlns:wpc="http://schemas.microsoft.com/office/word/2010/wordprocessingCanvas" xmlns:cx="http://schemas.microsoft.com/office/drawing/2014/chartex" xmlns:cx1="http://schemas.microsoft.com/office/drawing/2015/9/8/chartex" xmlns:cx2="http://schemas.microsoft.com/office/drawing/2015/10/21/chartex" xmlns:cx3="http://schemas.microsoft.com/office/drawing/2016/5/9/chartex" xmlns:cx4="http://schemas.microsoft.com/office/drawing/2016/5/10/chartex" xmlns:cx5="http://schemas.microsoft.com/office/drawing/2016/5/11/chartex" xmlns:cx6="http://schemas.microsoft.com/office/drawing/2016/5/12/chartex" xmlns:cx7="http://schemas.microsoft.com/office/drawing/2016/5/13/chartex" xmlns:cx8="http://schemas.microsoft.com/office/drawing/2016/5/14/chartex" xmlns:mc="http://schemas.openxmlformats.org/markup-compatibility/2006" xmlns:aink="http://schemas.microsoft.com/office/drawing/2016/ink" xmlns:am3d="http://schemas.microsoft.com/office/drawing/2017/model3d" xmlns:o="urn:schemas-microsoft-com:office:office" xmlns:oel="http://schemas.microsoft.com/office/2019/extlst" xmlns:r="http://schemas.openxmlformats.org/officeDocument/2006/relationships" xmlns:m="http://schemas.openxmlformats.org/officeDocument/2006/math" xmlns:v="urn:schemas-microsoft-com:vml" xmlns:wp14="http://schemas.microsoft.com/office/word/2010/wordprocessingDrawing" xmlns:wp="http://schemas.openxmlformats.org/drawingml/2006/wordprocessingDrawing" xmlns:w10="urn:schemas-microsoft-com:office:word" xmlns:w="http://schemas.openxmlformats.org/wordprocessingml/2006/main" xmlns:w14="http://schemas.microsoft.com/office/word/2010/wordml" xmlns:w15="http://schemas.microsoft.com/office/word/2012/wordml" xmlns:w16cei="http://schemas.microsoft.com/office/word/2026/wordml/cei" xmlns:w16cex="http://schemas.microsoft.com/office/word/2018/wordml/cex" xmlns:w16cid="http://schemas.microsoft.com/office/word/2016/wordml/cid" xmlns:w16="http://schemas.microsoft.com/office/word/2018/wordml" xmlns:w16du="http://schemas.microsoft.com/office/word/2023/wordml/word16du" xmlns:w16sdtdh="http://schemas.microsoft.com/office/word/2020/wordml/sdtdatahash" xmlns:w16sdtfl="http://schemas.microsoft.com/office/word/2024/wordml/sdtformatlock" xmlns:w16se="http://schemas.microsoft.com/office/word/2015/wordml/symex" xmlns:wpg="http://schemas.microsoft.com/office/word/2010/wordprocessingGroup" xmlns:wpi="http://schemas.microsoft.com/office/word/2010/wordprocessingInk" xmlns:wne="http://schemas.microsoft.com/office/word/2006/wordml" xmlns:wps="http://schemas.microsoft.com/office/word/2010/wordprocessingShape" mc:Ignorable="w14 w15 w16se w16cid w16 w16cex w16sdtdh w16sdtfl w16du wp14">
+<w:endnotes xmlns:wpc="http://schemas.microsoft.com/office/word/2010/wordprocessingCanvas" xmlns:cx="http://schemas.microsoft.com/office/drawing/2014/chartex" xmlns:cx1="http://schemas.microsoft.com/office/drawing/2015/9/8/chartex" xmlns:cx2="http://schemas.microsoft.com/office/drawing/2015/10/21/chartex" xmlns:cx3="http://schemas.microsoft.com/office/drawing/2016/5/9/chartex" xmlns:cx4="http://schemas.microsoft.com/office/drawing/2016/5/10/chartex" xmlns:cx5="http://schemas.microsoft.com/office/drawing/2016/5/11/chartex" xmlns:cx6="http://schemas.microsoft.com/office/drawing/2016/5/12/chartex" xmlns:cx7="http://schemas.microsoft.com/office/drawing/2016/5/13/chartex" xmlns:cx8="http://schemas.microsoft.com/office/drawing/2016/5/14/chartex" xmlns:mc="http://schemas.openxmlformats.org/markup-compatibility/2006" xmlns:aink="http://schemas.microsoft.com/office/drawing/2016/ink" xmlns:am3d="http://schemas.microsoft.com/office/drawing/2017/model3d" xmlns:o="urn:schemas-microsoft-com:office:office" xmlns:oel="http://schemas.microsoft.com/office/2019/extlst" xmlns:r="http://schemas.openxmlformats.org/officeDocument/2006/relationships" xmlns:m="http://schemas.openxmlformats.org/officeDocument/2006/math" xmlns:v="urn:schemas-microsoft-com:vml" xmlns:wp14="http://schemas.microsoft.com/office/word/2010/wordprocessingDrawing" xmlns:wp="http://schemas.openxmlformats.org/drawingml/2006/wordprocessingDrawing" xmlns:w10="urn:schemas-microsoft-com:office:word" xmlns:w="http://schemas.openxmlformats.org/wordprocessingml/2006/main" xmlns:w14="http://schemas.microsoft.com/office/word/2010/wordml" xmlns:w15="http://schemas.microsoft.com/office/word/2012/wordml" xmlns:w16cex="http://schemas.microsoft.com/office/word/2018/wordml/cex" xmlns:w16cid="http://schemas.microsoft.com/office/word/2016/wordml/cid" xmlns:w16="http://schemas.microsoft.com/office/word/2018/wordml" xmlns:w16du="http://schemas.microsoft.com/office/word/2023/wordml/word16du" xmlns:w16sdtdh="http://schemas.microsoft.com/office/word/2020/wordml/sdtdatahash" xmlns:w16sdtfl="http://schemas.microsoft.com/office/word/2024/wordml/sdtformatlock" xmlns:w16se="http://schemas.microsoft.com/office/word/2015/wordml/symex" xmlns:wpg="http://schemas.microsoft.com/office/word/2010/wordprocessingGroup" xmlns:wpi="http://schemas.microsoft.com/office/word/2010/wordprocessingInk" xmlns:wne="http://schemas.microsoft.com/office/word/2006/wordml" xmlns:wps="http://schemas.microsoft.com/office/word/2010/wordprocessingShape" mc:Ignorable="w14 w15 w16se w16cid w16 w16cex w16sdtdh w16sdtfl w16du wp14">
   <w:endnote w:type="separator" w:id="-1">
     <w:p>
       <w:pPr>
@@ -10754,7 +8800,7 @@
 </file>
 
 <file path=word/footer1.xml><?xml version="1.0" encoding="utf-8"?>
-<w:ftr xmlns:wpc="http://schemas.microsoft.com/office/word/2010/wordprocessingCanvas" xmlns:cx="http://schemas.microsoft.com/office/drawing/2014/chartex" xmlns:cx1="http://schemas.microsoft.com/office/drawing/2015/9/8/chartex" xmlns:cx2="http://schemas.microsoft.com/office/drawing/2015/10/21/chartex" xmlns:cx3="http://schemas.microsoft.com/office/drawing/2016/5/9/chartex" xmlns:cx4="http://schemas.microsoft.com/office/drawing/2016/5/10/chartex" xmlns:cx5="http://schemas.microsoft.com/office/drawing/2016/5/11/chartex" xmlns:cx6="http://schemas.microsoft.com/office/drawing/2016/5/12/chartex" xmlns:cx7="http://schemas.microsoft.com/office/drawing/2016/5/13/chartex" xmlns:cx8="http://schemas.microsoft.com/office/drawing/2016/5/14/chartex" xmlns:mc="http://schemas.openxmlformats.org/markup-compatibility/2006" xmlns:aink="http://schemas.microsoft.com/office/drawing/2016/ink" xmlns:am3d="http://schemas.microsoft.com/office/drawing/2017/model3d" xmlns:o="urn:schemas-microsoft-com:office:office" xmlns:oel="http://schemas.microsoft.com/office/2019/extlst" xmlns:r="http://schemas.openxmlformats.org/officeDocument/2006/relationships" xmlns:m="http://schemas.openxmlformats.org/officeDocument/2006/math" xmlns:v="urn:schemas-microsoft-com:vml" xmlns:wp14="http://schemas.microsoft.com/office/word/2010/wordprocessingDrawing" xmlns:wp="http://schemas.openxmlformats.org/drawingml/2006/wordprocessingDrawing" xmlns:w10="urn:schemas-microsoft-com:office:word" xmlns:w="http://schemas.openxmlformats.org/wordprocessingml/2006/main" xmlns:w14="http://schemas.microsoft.com/office/word/2010/wordml" xmlns:w15="http://schemas.microsoft.com/office/word/2012/wordml" xmlns:w16cei="http://schemas.microsoft.com/office/word/2026/wordml/cei" xmlns:w16cex="http://schemas.microsoft.com/office/word/2018/wordml/cex" xmlns:w16cid="http://schemas.microsoft.com/office/word/2016/wordml/cid" xmlns:w16="http://schemas.microsoft.com/office/word/2018/wordml" xmlns:w16du="http://schemas.microsoft.com/office/word/2023/wordml/word16du" xmlns:w16sdtdh="http://schemas.microsoft.com/office/word/2020/wordml/sdtdatahash" xmlns:w16sdtfl="http://schemas.microsoft.com/office/word/2024/wordml/sdtformatlock" xmlns:w16se="http://schemas.microsoft.com/office/word/2015/wordml/symex" xmlns:wpg="http://schemas.microsoft.com/office/word/2010/wordprocessingGroup" xmlns:wpi="http://schemas.microsoft.com/office/word/2010/wordprocessingInk" xmlns:wne="http://schemas.microsoft.com/office/word/2006/wordml" xmlns:wps="http://schemas.microsoft.com/office/word/2010/wordprocessingShape" mc:Ignorable="w14 w15 w16se w16cid w16 w16cex w16sdtdh w16sdtfl w16du wp14">
+<w:ftr xmlns:wpc="http://schemas.microsoft.com/office/word/2010/wordprocessingCanvas" xmlns:cx="http://schemas.microsoft.com/office/drawing/2014/chartex" xmlns:cx1="http://schemas.microsoft.com/office/drawing/2015/9/8/chartex" xmlns:cx2="http://schemas.microsoft.com/office/drawing/2015/10/21/chartex" xmlns:cx3="http://schemas.microsoft.com/office/drawing/2016/5/9/chartex" xmlns:cx4="http://schemas.microsoft.com/office/drawing/2016/5/10/chartex" xmlns:cx5="http://schemas.microsoft.com/office/drawing/2016/5/11/chartex" xmlns:cx6="http://schemas.microsoft.com/office/drawing/2016/5/12/chartex" xmlns:cx7="http://schemas.microsoft.com/office/drawing/2016/5/13/chartex" xmlns:cx8="http://schemas.microsoft.com/office/drawing/2016/5/14/chartex" xmlns:mc="http://schemas.openxmlformats.org/markup-compatibility/2006" xmlns:aink="http://schemas.microsoft.com/office/drawing/2016/ink" xmlns:am3d="http://schemas.microsoft.com/office/drawing/2017/model3d" xmlns:o="urn:schemas-microsoft-com:office:office" xmlns:oel="http://schemas.microsoft.com/office/2019/extlst" xmlns:r="http://schemas.openxmlformats.org/officeDocument/2006/relationships" xmlns:m="http://schemas.openxmlformats.org/officeDocument/2006/math" xmlns:v="urn:schemas-microsoft-com:vml" xmlns:wp14="http://schemas.microsoft.com/office/word/2010/wordprocessingDrawing" xmlns:wp="http://schemas.openxmlformats.org/drawingml/2006/wordprocessingDrawing" xmlns:w10="urn:schemas-microsoft-com:office:word" xmlns:w="http://schemas.openxmlformats.org/wordprocessingml/2006/main" xmlns:w14="http://schemas.microsoft.com/office/word/2010/wordml" xmlns:w15="http://schemas.microsoft.com/office/word/2012/wordml" xmlns:w16cex="http://schemas.microsoft.com/office/word/2018/wordml/cex" xmlns:w16cid="http://schemas.microsoft.com/office/word/2016/wordml/cid" xmlns:w16="http://schemas.microsoft.com/office/word/2018/wordml" xmlns:w16du="http://schemas.microsoft.com/office/word/2023/wordml/word16du" xmlns:w16sdtdh="http://schemas.microsoft.com/office/word/2020/wordml/sdtdatahash" xmlns:w16sdtfl="http://schemas.microsoft.com/office/word/2024/wordml/sdtformatlock" xmlns:w16se="http://schemas.microsoft.com/office/word/2015/wordml/symex" xmlns:wpg="http://schemas.microsoft.com/office/word/2010/wordprocessingGroup" xmlns:wpi="http://schemas.microsoft.com/office/word/2010/wordprocessingInk" xmlns:wne="http://schemas.microsoft.com/office/word/2006/wordml" xmlns:wps="http://schemas.microsoft.com/office/word/2010/wordprocessingShape" mc:Ignorable="w14 w15 w16se w16cid w16 w16cex w16sdtdh w16sdtfl w16du wp14">
   <w:p>
     <w:pPr>
       <w:pBdr>
@@ -10833,7 +8879,7 @@
 </file>
 
 <file path=word/footnotes.xml><?xml version="1.0" encoding="utf-8"?>
-<w:footnotes xmlns:wpc="http://schemas.microsoft.com/office/word/2010/wordprocessingCanvas" xmlns:cx="http://schemas.microsoft.com/office/drawing/2014/chartex" xmlns:cx1="http://schemas.microsoft.com/office/drawing/2015/9/8/chartex" xmlns:cx2="http://schemas.microsoft.com/office/drawing/2015/10/21/chartex" xmlns:cx3="http://schemas.microsoft.com/office/drawing/2016/5/9/chartex" xmlns:cx4="http://schemas.microsoft.com/office/drawing/2016/5/10/chartex" xmlns:cx5="http://schemas.microsoft.com/office/drawing/2016/5/11/chartex" xmlns:cx6="http://schemas.microsoft.com/office/drawing/2016/5/12/chartex" xmlns:cx7="http://schemas.microsoft.com/office/drawing/2016/5/13/chartex" xmlns:cx8="http://schemas.microsoft.com/office/drawing/2016/5/14/chartex" xmlns:mc="http://schemas.openxmlformats.org/markup-compatibility/2006" xmlns:aink="http://schemas.microsoft.com/office/drawing/2016/ink" xmlns:am3d="http://schemas.microsoft.com/office/drawing/2017/model3d" xmlns:o="urn:schemas-microsoft-com:office:office" xmlns:oel="http://schemas.microsoft.com/office/2019/extlst" xmlns:r="http://schemas.openxmlformats.org/officeDocument/2006/relationships" xmlns:m="http://schemas.openxmlformats.org/officeDocument/2006/math" xmlns:v="urn:schemas-microsoft-com:vml" xmlns:wp14="http://schemas.microsoft.com/office/word/2010/wordprocessingDrawing" xmlns:wp="http://schemas.openxmlformats.org/drawingml/2006/wordprocessingDrawing" xmlns:w10="urn:schemas-microsoft-com:office:word" xmlns:w="http://schemas.openxmlformats.org/wordprocessingml/2006/main" xmlns:w14="http://schemas.microsoft.com/office/word/2010/wordml" xmlns:w15="http://schemas.microsoft.com/office/word/2012/wordml" xmlns:w16cei="http://schemas.microsoft.com/office/word/2026/wordml/cei" xmlns:w16cex="http://schemas.microsoft.com/office/word/2018/wordml/cex" xmlns:w16cid="http://schemas.microsoft.com/office/word/2016/wordml/cid" xmlns:w16="http://schemas.microsoft.com/office/word/2018/wordml" xmlns:w16du="http://schemas.microsoft.com/office/word/2023/wordml/word16du" xmlns:w16sdtdh="http://schemas.microsoft.com/office/word/2020/wordml/sdtdatahash" xmlns:w16sdtfl="http://schemas.microsoft.com/office/word/2024/wordml/sdtformatlock" xmlns:w16se="http://schemas.microsoft.com/office/word/2015/wordml/symex" xmlns:wpg="http://schemas.microsoft.com/office/word/2010/wordprocessingGroup" xmlns:wpi="http://schemas.microsoft.com/office/word/2010/wordprocessingInk" xmlns:wne="http://schemas.microsoft.com/office/word/2006/wordml" xmlns:wps="http://schemas.microsoft.com/office/word/2010/wordprocessingShape" mc:Ignorable="w14 w15 w16se w16cid w16 w16cex w16sdtdh w16sdtfl w16du wp14">
+<w:footnotes xmlns:wpc="http://schemas.microsoft.com/office/word/2010/wordprocessingCanvas" xmlns:cx="http://schemas.microsoft.com/office/drawing/2014/chartex" xmlns:cx1="http://schemas.microsoft.com/office/drawing/2015/9/8/chartex" xmlns:cx2="http://schemas.microsoft.com/office/drawing/2015/10/21/chartex" xmlns:cx3="http://schemas.microsoft.com/office/drawing/2016/5/9/chartex" xmlns:cx4="http://schemas.microsoft.com/office/drawing/2016/5/10/chartex" xmlns:cx5="http://schemas.microsoft.com/office/drawing/2016/5/11/chartex" xmlns:cx6="http://schemas.microsoft.com/office/drawing/2016/5/12/chartex" xmlns:cx7="http://schemas.microsoft.com/office/drawing/2016/5/13/chartex" xmlns:cx8="http://schemas.microsoft.com/office/drawing/2016/5/14/chartex" xmlns:mc="http://schemas.openxmlformats.org/markup-compatibility/2006" xmlns:aink="http://schemas.microsoft.com/office/drawing/2016/ink" xmlns:am3d="http://schemas.microsoft.com/office/drawing/2017/model3d" xmlns:o="urn:schemas-microsoft-com:office:office" xmlns:oel="http://schemas.microsoft.com/office/2019/extlst" xmlns:r="http://schemas.openxmlformats.org/officeDocument/2006/relationships" xmlns:m="http://schemas.openxmlformats.org/officeDocument/2006/math" xmlns:v="urn:schemas-microsoft-com:vml" xmlns:wp14="http://schemas.microsoft.com/office/word/2010/wordprocessingDrawing" xmlns:wp="http://schemas.openxmlformats.org/drawingml/2006/wordprocessingDrawing" xmlns:w10="urn:schemas-microsoft-com:office:word" xmlns:w="http://schemas.openxmlformats.org/wordprocessingml/2006/main" xmlns:w14="http://schemas.microsoft.com/office/word/2010/wordml" xmlns:w15="http://schemas.microsoft.com/office/word/2012/wordml" xmlns:w16cex="http://schemas.microsoft.com/office/word/2018/wordml/cex" xmlns:w16cid="http://schemas.microsoft.com/office/word/2016/wordml/cid" xmlns:w16="http://schemas.microsoft.com/office/word/2018/wordml" xmlns:w16du="http://schemas.microsoft.com/office/word/2023/wordml/word16du" xmlns:w16sdtdh="http://schemas.microsoft.com/office/word/2020/wordml/sdtdatahash" xmlns:w16sdtfl="http://schemas.microsoft.com/office/word/2024/wordml/sdtformatlock" xmlns:w16se="http://schemas.microsoft.com/office/word/2015/wordml/symex" xmlns:wpg="http://schemas.microsoft.com/office/word/2010/wordprocessingGroup" xmlns:wpi="http://schemas.microsoft.com/office/word/2010/wordprocessingInk" xmlns:wne="http://schemas.microsoft.com/office/word/2006/wordml" xmlns:wps="http://schemas.microsoft.com/office/word/2010/wordprocessingShape" mc:Ignorable="w14 w15 w16se w16cid w16 w16cex w16sdtdh w16sdtfl w16du wp14">
   <w:footnote w:type="separator" w:id="-1">
     <w:p>
       <w:pPr>
@@ -10858,7 +8904,7 @@
 </file>
 
 <file path=word/header1.xml><?xml version="1.0" encoding="utf-8"?>
-<w:hdr xmlns:wpc="http://schemas.microsoft.com/office/word/2010/wordprocessingCanvas" xmlns:cx="http://schemas.microsoft.com/office/drawing/2014/chartex" xmlns:cx1="http://schemas.microsoft.com/office/drawing/2015/9/8/chartex" xmlns:cx2="http://schemas.microsoft.com/office/drawing/2015/10/21/chartex" xmlns:cx3="http://schemas.microsoft.com/office/drawing/2016/5/9/chartex" xmlns:cx4="http://schemas.microsoft.com/office/drawing/2016/5/10/chartex" xmlns:cx5="http://schemas.microsoft.com/office/drawing/2016/5/11/chartex" xmlns:cx6="http://schemas.microsoft.com/office/drawing/2016/5/12/chartex" xmlns:cx7="http://schemas.microsoft.com/office/drawing/2016/5/13/chartex" xmlns:cx8="http://schemas.microsoft.com/office/drawing/2016/5/14/chartex" xmlns:mc="http://schemas.openxmlformats.org/markup-compatibility/2006" xmlns:aink="http://schemas.microsoft.com/office/drawing/2016/ink" xmlns:am3d="http://schemas.microsoft.com/office/drawing/2017/model3d" xmlns:o="urn:schemas-microsoft-com:office:office" xmlns:oel="http://schemas.microsoft.com/office/2019/extlst" xmlns:r="http://schemas.openxmlformats.org/officeDocument/2006/relationships" xmlns:m="http://schemas.openxmlformats.org/officeDocument/2006/math" xmlns:v="urn:schemas-microsoft-com:vml" xmlns:wp14="http://schemas.microsoft.com/office/word/2010/wordprocessingDrawing" xmlns:wp="http://schemas.openxmlformats.org/drawingml/2006/wordprocessingDrawing" xmlns:w10="urn:schemas-microsoft-com:office:word" xmlns:w="http://schemas.openxmlformats.org/wordprocessingml/2006/main" xmlns:w14="http://schemas.microsoft.com/office/word/2010/wordml" xmlns:w15="http://schemas.microsoft.com/office/word/2012/wordml" xmlns:w16cei="http://schemas.microsoft.com/office/word/2026/wordml/cei" xmlns:w16cex="http://schemas.microsoft.com/office/word/2018/wordml/cex" xmlns:w16cid="http://schemas.microsoft.com/office/word/2016/wordml/cid" xmlns:w16="http://schemas.microsoft.com/office/word/2018/wordml" xmlns:w16du="http://schemas.microsoft.com/office/word/2023/wordml/word16du" xmlns:w16sdtdh="http://schemas.microsoft.com/office/word/2020/wordml/sdtdatahash" xmlns:w16sdtfl="http://schemas.microsoft.com/office/word/2024/wordml/sdtformatlock" xmlns:w16se="http://schemas.microsoft.com/office/word/2015/wordml/symex" xmlns:wpg="http://schemas.microsoft.com/office/word/2010/wordprocessingGroup" xmlns:wpi="http://schemas.microsoft.com/office/word/2010/wordprocessingInk" xmlns:wne="http://schemas.microsoft.com/office/word/2006/wordml" xmlns:wps="http://schemas.microsoft.com/office/word/2010/wordprocessingShape" mc:Ignorable="w14 w15 w16se w16cid w16 w16cex w16sdtdh w16sdtfl w16du wp14">
+<w:hdr xmlns:wpc="http://schemas.microsoft.com/office/word/2010/wordprocessingCanvas" xmlns:cx="http://schemas.microsoft.com/office/drawing/2014/chartex" xmlns:cx1="http://schemas.microsoft.com/office/drawing/2015/9/8/chartex" xmlns:cx2="http://schemas.microsoft.com/office/drawing/2015/10/21/chartex" xmlns:cx3="http://schemas.microsoft.com/office/drawing/2016/5/9/chartex" xmlns:cx4="http://schemas.microsoft.com/office/drawing/2016/5/10/chartex" xmlns:cx5="http://schemas.microsoft.com/office/drawing/2016/5/11/chartex" xmlns:cx6="http://schemas.microsoft.com/office/drawing/2016/5/12/chartex" xmlns:cx7="http://schemas.microsoft.com/office/drawing/2016/5/13/chartex" xmlns:cx8="http://schemas.microsoft.com/office/drawing/2016/5/14/chartex" xmlns:mc="http://schemas.openxmlformats.org/markup-compatibility/2006" xmlns:aink="http://schemas.microsoft.com/office/drawing/2016/ink" xmlns:am3d="http://schemas.microsoft.com/office/drawing/2017/model3d" xmlns:o="urn:schemas-microsoft-com:office:office" xmlns:oel="http://schemas.microsoft.com/office/2019/extlst" xmlns:r="http://schemas.openxmlformats.org/officeDocument/2006/relationships" xmlns:m="http://schemas.openxmlformats.org/officeDocument/2006/math" xmlns:v="urn:schemas-microsoft-com:vml" xmlns:wp14="http://schemas.microsoft.com/office/word/2010/wordprocessingDrawing" xmlns:wp="http://schemas.openxmlformats.org/drawingml/2006/wordprocessingDrawing" xmlns:w10="urn:schemas-microsoft-com:office:word" xmlns:w="http://schemas.openxmlformats.org/wordprocessingml/2006/main" xmlns:w14="http://schemas.microsoft.com/office/word/2010/wordml" xmlns:w15="http://schemas.microsoft.com/office/word/2012/wordml" xmlns:w16cex="http://schemas.microsoft.com/office/word/2018/wordml/cex" xmlns:w16cid="http://schemas.microsoft.com/office/word/2016/wordml/cid" xmlns:w16="http://schemas.microsoft.com/office/word/2018/wordml" xmlns:w16du="http://schemas.microsoft.com/office/word/2023/wordml/word16du" xmlns:w16sdtdh="http://schemas.microsoft.com/office/word/2020/wordml/sdtdatahash" xmlns:w16sdtfl="http://schemas.microsoft.com/office/word/2024/wordml/sdtformatlock" xmlns:w16se="http://schemas.microsoft.com/office/word/2015/wordml/symex" xmlns:wpg="http://schemas.microsoft.com/office/word/2010/wordprocessingGroup" xmlns:wpi="http://schemas.microsoft.com/office/word/2010/wordprocessingInk" xmlns:wne="http://schemas.microsoft.com/office/word/2006/wordml" xmlns:wps="http://schemas.microsoft.com/office/word/2010/wordprocessingShape" mc:Ignorable="w14 w15 w16se w16cid w16 w16cex w16sdtdh w16sdtfl w16du wp14">
   <w:p>
     <w:pPr>
       <w:pStyle w:val="Header"/>

</xml_diff>